<commit_message>
S10: informe actualizado sin capturas, con enlaces directos de evidencia a GitHub
</commit_message>
<xml_diff>
--- a/SI886-S10-TALLER-GianFrancoArocutipa.docx
+++ b/SI886-S10-TALLER-GianFrancoArocutipa.docx
@@ -453,7 +453,7 @@
       <w:pPr>
         <w:pStyle w:val="Ttulo1"/>
       </w:pPr>
-      <w:bookmarkStart w:id="1" w:name="_Toc242976713"/>
+      <w:bookmarkStart w:id="1" w:name="_Toc242977359"/>
       <w:r>
         <w:lastRenderedPageBreak/>
         <w:t>Índice</w:t>
@@ -481,7 +481,7 @@
       <w:r>
         <w:fldChar w:fldCharType="separate"/>
       </w:r>
-      <w:hyperlink w:anchor="_Toc242976713" w:history="1">
+      <w:hyperlink w:anchor="_Toc242977359" w:history="1">
         <w:r>
           <w:rPr>
             <w:rStyle w:val="Hipervnculo"/>
@@ -508,7 +508,7 @@
             <w:noProof/>
             <w:webHidden/>
           </w:rPr>
-          <w:instrText xml:space="preserve"> PAGEREF _Toc242976713 \h </w:instrText>
+          <w:instrText xml:space="preserve"> PAGEREF _Toc242977359 \h </w:instrText>
         </w:r>
         <w:r>
           <w:rPr>
@@ -551,7 +551,7 @@
           <w:lang w:val="es-PE" w:eastAsia="es-PE"/>
         </w:rPr>
       </w:pPr>
-      <w:hyperlink w:anchor="_Toc242976714" w:history="1">
+      <w:hyperlink w:anchor="_Toc242977360" w:history="1">
         <w:r>
           <w:rPr>
             <w:rStyle w:val="Hipervnculo"/>
@@ -578,7 +578,7 @@
             <w:noProof/>
             <w:webHidden/>
           </w:rPr>
-          <w:instrText xml:space="preserve"> PAGEREF _Toc242976714 \h </w:instrText>
+          <w:instrText xml:space="preserve"> PAGEREF _Toc242977360 \h </w:instrText>
         </w:r>
         <w:r>
           <w:rPr>
@@ -621,7 +621,7 @@
           <w:lang w:val="es-PE" w:eastAsia="es-PE"/>
         </w:rPr>
       </w:pPr>
-      <w:hyperlink w:anchor="_Toc242976715" w:history="1">
+      <w:hyperlink w:anchor="_Toc242977361" w:history="1">
         <w:r>
           <w:rPr>
             <w:rStyle w:val="Hipervnculo"/>
@@ -649,7 +649,7 @@
             <w:noProof/>
             <w:webHidden/>
           </w:rPr>
-          <w:instrText xml:space="preserve"> PAGEREF _Toc242976715 \h </w:instrText>
+          <w:instrText xml:space="preserve"> PAGEREF _Toc242977361 \h </w:instrText>
         </w:r>
         <w:r>
           <w:rPr>
@@ -692,7 +692,7 @@
           <w:lang w:val="es-PE" w:eastAsia="es-PE"/>
         </w:rPr>
       </w:pPr>
-      <w:hyperlink w:anchor="_Toc242976716" w:history="1">
+      <w:hyperlink w:anchor="_Toc242977362" w:history="1">
         <w:r>
           <w:rPr>
             <w:rStyle w:val="Hipervnculo"/>
@@ -720,7 +720,7 @@
             <w:noProof/>
             <w:webHidden/>
           </w:rPr>
-          <w:instrText xml:space="preserve"> PAGEREF _Toc242976716 \h </w:instrText>
+          <w:instrText xml:space="preserve"> PAGEREF _Toc242977362 \h </w:instrText>
         </w:r>
         <w:r>
           <w:rPr>
@@ -763,7 +763,7 @@
           <w:lang w:val="es-PE" w:eastAsia="es-PE"/>
         </w:rPr>
       </w:pPr>
-      <w:hyperlink w:anchor="_Toc242976717" w:history="1">
+      <w:hyperlink w:anchor="_Toc242977363" w:history="1">
         <w:r>
           <w:rPr>
             <w:rStyle w:val="Hipervnculo"/>
@@ -791,7 +791,7 @@
             <w:noProof/>
             <w:webHidden/>
           </w:rPr>
-          <w:instrText xml:space="preserve"> PAGEREF _Toc242976717 \h </w:instrText>
+          <w:instrText xml:space="preserve"> PAGEREF _Toc242977363 \h </w:instrText>
         </w:r>
         <w:r>
           <w:rPr>
@@ -834,7 +834,7 @@
           <w:lang w:val="es-PE" w:eastAsia="es-PE"/>
         </w:rPr>
       </w:pPr>
-      <w:hyperlink w:anchor="_Toc242976718" w:history="1">
+      <w:hyperlink w:anchor="_Toc242977364" w:history="1">
         <w:r>
           <w:rPr>
             <w:rStyle w:val="Hipervnculo"/>
@@ -862,7 +862,7 @@
             <w:noProof/>
             <w:webHidden/>
           </w:rPr>
-          <w:instrText xml:space="preserve"> PAGEREF _Toc242976718 \h </w:instrText>
+          <w:instrText xml:space="preserve"> PAGEREF _Toc242977364 \h </w:instrText>
         </w:r>
         <w:r>
           <w:rPr>
@@ -905,7 +905,7 @@
           <w:lang w:val="es-PE" w:eastAsia="es-PE"/>
         </w:rPr>
       </w:pPr>
-      <w:hyperlink w:anchor="_Toc242976719" w:history="1">
+      <w:hyperlink w:anchor="_Toc242977365" w:history="1">
         <w:r>
           <w:rPr>
             <w:rStyle w:val="Hipervnculo"/>
@@ -933,7 +933,7 @@
             <w:noProof/>
             <w:webHidden/>
           </w:rPr>
-          <w:instrText xml:space="preserve"> PAGEREF _Toc242976719 \h </w:instrText>
+          <w:instrText xml:space="preserve"> PAGEREF _Toc242977365 \h </w:instrText>
         </w:r>
         <w:r>
           <w:rPr>
@@ -976,7 +976,7 @@
           <w:lang w:val="es-PE" w:eastAsia="es-PE"/>
         </w:rPr>
       </w:pPr>
-      <w:hyperlink w:anchor="_Toc242976720" w:history="1">
+      <w:hyperlink w:anchor="_Toc242977366" w:history="1">
         <w:r>
           <w:rPr>
             <w:rStyle w:val="Hipervnculo"/>
@@ -1004,7 +1004,7 @@
             <w:noProof/>
             <w:webHidden/>
           </w:rPr>
-          <w:instrText xml:space="preserve"> PAGEREF _Toc242976720 \h </w:instrText>
+          <w:instrText xml:space="preserve"> PAGEREF _Toc242977366 \h </w:instrText>
         </w:r>
         <w:r>
           <w:rPr>
@@ -1047,7 +1047,7 @@
           <w:lang w:val="es-PE" w:eastAsia="es-PE"/>
         </w:rPr>
       </w:pPr>
-      <w:hyperlink w:anchor="_Toc242976721" w:history="1">
+      <w:hyperlink w:anchor="_Toc242977367" w:history="1">
         <w:r>
           <w:rPr>
             <w:rStyle w:val="Hipervnculo"/>
@@ -1075,7 +1075,7 @@
             <w:noProof/>
             <w:webHidden/>
           </w:rPr>
-          <w:instrText xml:space="preserve"> PAGEREF _Toc242976721 \h </w:instrText>
+          <w:instrText xml:space="preserve"> PAGEREF _Toc242977367 \h </w:instrText>
         </w:r>
         <w:r>
           <w:rPr>
@@ -1118,7 +1118,7 @@
           <w:lang w:val="es-PE" w:eastAsia="es-PE"/>
         </w:rPr>
       </w:pPr>
-      <w:hyperlink w:anchor="_Toc242976722" w:history="1">
+      <w:hyperlink w:anchor="_Toc242977368" w:history="1">
         <w:r>
           <w:rPr>
             <w:rStyle w:val="Hipervnculo"/>
@@ -1146,7 +1146,7 @@
             <w:noProof/>
             <w:webHidden/>
           </w:rPr>
-          <w:instrText xml:space="preserve"> PAGEREF _Toc242976722 \h </w:instrText>
+          <w:instrText xml:space="preserve"> PAGEREF _Toc242977368 \h </w:instrText>
         </w:r>
         <w:r>
           <w:rPr>
@@ -1189,7 +1189,7 @@
           <w:lang w:val="es-PE" w:eastAsia="es-PE"/>
         </w:rPr>
       </w:pPr>
-      <w:hyperlink w:anchor="_Toc242976723" w:history="1">
+      <w:hyperlink w:anchor="_Toc242977369" w:history="1">
         <w:r>
           <w:rPr>
             <w:rStyle w:val="Hipervnculo"/>
@@ -1217,7 +1217,7 @@
             <w:noProof/>
             <w:webHidden/>
           </w:rPr>
-          <w:instrText xml:space="preserve"> PAGEREF _Toc242976723 \h </w:instrText>
+          <w:instrText xml:space="preserve"> PAGEREF _Toc242977369 \h </w:instrText>
         </w:r>
         <w:r>
           <w:rPr>
@@ -1260,7 +1260,7 @@
           <w:lang w:val="es-PE" w:eastAsia="es-PE"/>
         </w:rPr>
       </w:pPr>
-      <w:hyperlink w:anchor="_Toc242976724" w:history="1">
+      <w:hyperlink w:anchor="_Toc242977370" w:history="1">
         <w:r>
           <w:rPr>
             <w:rStyle w:val="Hipervnculo"/>
@@ -1288,7 +1288,7 @@
             <w:noProof/>
             <w:webHidden/>
           </w:rPr>
-          <w:instrText xml:space="preserve"> PAGEREF _Toc242976724 \h </w:instrText>
+          <w:instrText xml:space="preserve"> PAGEREF _Toc242977370 \h </w:instrText>
         </w:r>
         <w:r>
           <w:rPr>
@@ -1331,7 +1331,7 @@
           <w:lang w:val="es-PE" w:eastAsia="es-PE"/>
         </w:rPr>
       </w:pPr>
-      <w:hyperlink w:anchor="_Toc242976725" w:history="1">
+      <w:hyperlink w:anchor="_Toc242977371" w:history="1">
         <w:r>
           <w:rPr>
             <w:rStyle w:val="Hipervnculo"/>
@@ -1359,7 +1359,7 @@
             <w:noProof/>
             <w:webHidden/>
           </w:rPr>
-          <w:instrText xml:space="preserve"> PAGEREF _Toc242976725 \h </w:instrText>
+          <w:instrText xml:space="preserve"> PAGEREF _Toc242977371 \h </w:instrText>
         </w:r>
         <w:r>
           <w:rPr>
@@ -1402,7 +1402,7 @@
           <w:lang w:val="es-PE" w:eastAsia="es-PE"/>
         </w:rPr>
       </w:pPr>
-      <w:hyperlink w:anchor="_Toc242976726" w:history="1">
+      <w:hyperlink w:anchor="_Toc242977372" w:history="1">
         <w:r>
           <w:rPr>
             <w:rStyle w:val="Hipervnculo"/>
@@ -1430,7 +1430,7 @@
             <w:noProof/>
             <w:webHidden/>
           </w:rPr>
-          <w:instrText xml:space="preserve"> PAGEREF _Toc242976726 \h </w:instrText>
+          <w:instrText xml:space="preserve"> PAGEREF _Toc242977372 \h </w:instrText>
         </w:r>
         <w:r>
           <w:rPr>
@@ -1450,7 +1450,7 @@
             <w:noProof/>
             <w:webHidden/>
           </w:rPr>
-          <w:t>10</w:t>
+          <w:t>9</w:t>
         </w:r>
         <w:r>
           <w:rPr>
@@ -1473,7 +1473,7 @@
           <w:lang w:val="es-PE" w:eastAsia="es-PE"/>
         </w:rPr>
       </w:pPr>
-      <w:hyperlink w:anchor="_Toc242976727" w:history="1">
+      <w:hyperlink w:anchor="_Toc242977373" w:history="1">
         <w:r>
           <w:rPr>
             <w:rStyle w:val="Hipervnculo"/>
@@ -1501,7 +1501,7 @@
             <w:noProof/>
             <w:webHidden/>
           </w:rPr>
-          <w:instrText xml:space="preserve"> PAGEREF _Toc242976727 \h </w:instrText>
+          <w:instrText xml:space="preserve"> PAGEREF _Toc242977373 \h </w:instrText>
         </w:r>
         <w:r>
           <w:rPr>
@@ -1521,7 +1521,7 @@
             <w:noProof/>
             <w:webHidden/>
           </w:rPr>
-          <w:t>11</w:t>
+          <w:t>9</w:t>
         </w:r>
         <w:r>
           <w:rPr>
@@ -1544,7 +1544,7 @@
           <w:lang w:val="es-PE" w:eastAsia="es-PE"/>
         </w:rPr>
       </w:pPr>
-      <w:hyperlink w:anchor="_Toc242976728" w:history="1">
+      <w:hyperlink w:anchor="_Toc242977374" w:history="1">
         <w:r>
           <w:rPr>
             <w:rStyle w:val="Hipervnculo"/>
@@ -1572,7 +1572,7 @@
             <w:noProof/>
             <w:webHidden/>
           </w:rPr>
-          <w:instrText xml:space="preserve"> PAGEREF _Toc242976728 \h </w:instrText>
+          <w:instrText xml:space="preserve"> PAGEREF _Toc242977374 \h </w:instrText>
         </w:r>
         <w:r>
           <w:rPr>
@@ -1592,7 +1592,7 @@
             <w:noProof/>
             <w:webHidden/>
           </w:rPr>
-          <w:t>11</w:t>
+          <w:t>10</w:t>
         </w:r>
         <w:r>
           <w:rPr>
@@ -1615,7 +1615,7 @@
           <w:lang w:val="es-PE" w:eastAsia="es-PE"/>
         </w:rPr>
       </w:pPr>
-      <w:hyperlink w:anchor="_Toc242976729" w:history="1">
+      <w:hyperlink w:anchor="_Toc242977375" w:history="1">
         <w:r>
           <w:rPr>
             <w:rStyle w:val="Hipervnculo"/>
@@ -1643,7 +1643,7 @@
             <w:noProof/>
             <w:webHidden/>
           </w:rPr>
-          <w:instrText xml:space="preserve"> PAGEREF _Toc242976729 \h </w:instrText>
+          <w:instrText xml:space="preserve"> PAGEREF _Toc242977375 \h </w:instrText>
         </w:r>
         <w:r>
           <w:rPr>
@@ -1663,7 +1663,7 @@
             <w:noProof/>
             <w:webHidden/>
           </w:rPr>
-          <w:t>11</w:t>
+          <w:t>10</w:t>
         </w:r>
         <w:r>
           <w:rPr>
@@ -1686,7 +1686,7 @@
           <w:lang w:val="es-PE" w:eastAsia="es-PE"/>
         </w:rPr>
       </w:pPr>
-      <w:hyperlink w:anchor="_Toc242976730" w:history="1">
+      <w:hyperlink w:anchor="_Toc242977376" w:history="1">
         <w:r>
           <w:rPr>
             <w:rStyle w:val="Hipervnculo"/>
@@ -1714,7 +1714,7 @@
             <w:noProof/>
             <w:webHidden/>
           </w:rPr>
-          <w:instrText xml:space="preserve"> PAGEREF _Toc242976730 \h </w:instrText>
+          <w:instrText xml:space="preserve"> PAGEREF _Toc242977376 \h </w:instrText>
         </w:r>
         <w:r>
           <w:rPr>
@@ -1734,7 +1734,7 @@
             <w:noProof/>
             <w:webHidden/>
           </w:rPr>
-          <w:t>12</w:t>
+          <w:t>10</w:t>
         </w:r>
         <w:r>
           <w:rPr>
@@ -1757,7 +1757,7 @@
           <w:lang w:val="es-PE" w:eastAsia="es-PE"/>
         </w:rPr>
       </w:pPr>
-      <w:hyperlink w:anchor="_Toc242976731" w:history="1">
+      <w:hyperlink w:anchor="_Toc242977377" w:history="1">
         <w:r>
           <w:rPr>
             <w:rStyle w:val="Hipervnculo"/>
@@ -1785,7 +1785,7 @@
             <w:noProof/>
             <w:webHidden/>
           </w:rPr>
-          <w:instrText xml:space="preserve"> PAGEREF _Toc242976731 \h </w:instrText>
+          <w:instrText xml:space="preserve"> PAGEREF _Toc242977377 \h </w:instrText>
         </w:r>
         <w:r>
           <w:rPr>
@@ -1805,7 +1805,7 @@
             <w:noProof/>
             <w:webHidden/>
           </w:rPr>
-          <w:t>13</w:t>
+          <w:t>11</w:t>
         </w:r>
         <w:r>
           <w:rPr>
@@ -1828,7 +1828,7 @@
           <w:lang w:val="es-PE" w:eastAsia="es-PE"/>
         </w:rPr>
       </w:pPr>
-      <w:hyperlink w:anchor="_Toc242976732" w:history="1">
+      <w:hyperlink w:anchor="_Toc242977378" w:history="1">
         <w:r>
           <w:rPr>
             <w:rStyle w:val="Hipervnculo"/>
@@ -1856,7 +1856,7 @@
             <w:noProof/>
             <w:webHidden/>
           </w:rPr>
-          <w:instrText xml:space="preserve"> PAGEREF _Toc242976732 \h </w:instrText>
+          <w:instrText xml:space="preserve"> PAGEREF _Toc242977378 \h </w:instrText>
         </w:r>
         <w:r>
           <w:rPr>
@@ -1876,7 +1876,7 @@
             <w:noProof/>
             <w:webHidden/>
           </w:rPr>
-          <w:t>13</w:t>
+          <w:t>12</w:t>
         </w:r>
         <w:r>
           <w:rPr>
@@ -1899,7 +1899,7 @@
           <w:lang w:val="es-PE" w:eastAsia="es-PE"/>
         </w:rPr>
       </w:pPr>
-      <w:hyperlink w:anchor="_Toc242976733" w:history="1">
+      <w:hyperlink w:anchor="_Toc242977379" w:history="1">
         <w:r>
           <w:rPr>
             <w:rStyle w:val="Hipervnculo"/>
@@ -1927,7 +1927,7 @@
             <w:noProof/>
             <w:webHidden/>
           </w:rPr>
-          <w:instrText xml:space="preserve"> PAGEREF _Toc242976733 \h </w:instrText>
+          <w:instrText xml:space="preserve"> PAGEREF _Toc242977379 \h </w:instrText>
         </w:r>
         <w:r>
           <w:rPr>
@@ -1947,7 +1947,7 @@
             <w:noProof/>
             <w:webHidden/>
           </w:rPr>
-          <w:t>14</w:t>
+          <w:t>13</w:t>
         </w:r>
         <w:r>
           <w:rPr>
@@ -1970,7 +1970,7 @@
           <w:lang w:val="es-PE" w:eastAsia="es-PE"/>
         </w:rPr>
       </w:pPr>
-      <w:hyperlink w:anchor="_Toc242976734" w:history="1">
+      <w:hyperlink w:anchor="_Toc242977380" w:history="1">
         <w:r>
           <w:rPr>
             <w:rStyle w:val="Hipervnculo"/>
@@ -1998,7 +1998,7 @@
             <w:noProof/>
             <w:webHidden/>
           </w:rPr>
-          <w:instrText xml:space="preserve"> PAGEREF _Toc242976734 \h </w:instrText>
+          <w:instrText xml:space="preserve"> PAGEREF _Toc242977380 \h </w:instrText>
         </w:r>
         <w:r>
           <w:rPr>
@@ -2018,7 +2018,7 @@
             <w:noProof/>
             <w:webHidden/>
           </w:rPr>
-          <w:t>14</w:t>
+          <w:t>13</w:t>
         </w:r>
         <w:r>
           <w:rPr>
@@ -2043,7 +2043,7 @@
       <w:pPr>
         <w:pStyle w:val="Ttulo1"/>
       </w:pPr>
-      <w:bookmarkStart w:id="2" w:name="_Toc242976714"/>
+      <w:bookmarkStart w:id="2" w:name="_Toc242977360"/>
       <w:r>
         <w:lastRenderedPageBreak/>
         <w:t>Cómo se usa esta plantilla</w:t>
@@ -2217,7 +2217,7 @@
         <w:pStyle w:val="Ttulo1"/>
         <w:spacing w:after="120"/>
       </w:pPr>
-      <w:bookmarkStart w:id="3" w:name="_Toc242976715"/>
+      <w:bookmarkStart w:id="3" w:name="_Toc242977361"/>
       <w:r>
         <w:rPr>
           <w:rFonts w:ascii="Calibri" w:hAnsi="Calibri"/>
@@ -2232,7 +2232,7 @@
         <w:pStyle w:val="Ttulo2"/>
         <w:spacing w:after="80"/>
       </w:pPr>
-      <w:bookmarkStart w:id="4" w:name="_Toc242976716"/>
+      <w:bookmarkStart w:id="4" w:name="_Toc242977362"/>
       <w:r>
         <w:rPr>
           <w:rFonts w:ascii="Calibri" w:hAnsi="Calibri"/>
@@ -2260,7 +2260,7 @@
         <w:pStyle w:val="Ttulo2"/>
         <w:spacing w:after="80"/>
       </w:pPr>
-      <w:bookmarkStart w:id="5" w:name="_Toc242976717"/>
+      <w:bookmarkStart w:id="5" w:name="_Toc242977363"/>
       <w:r>
         <w:rPr>
           <w:rFonts w:ascii="Calibri" w:hAnsi="Calibri"/>
@@ -2476,7 +2476,7 @@
         <w:pStyle w:val="Ttulo2"/>
         <w:spacing w:after="80"/>
       </w:pPr>
-      <w:bookmarkStart w:id="6" w:name="_Toc242976718"/>
+      <w:bookmarkStart w:id="6" w:name="_Toc242977364"/>
       <w:r>
         <w:rPr>
           <w:rFonts w:ascii="Calibri" w:hAnsi="Calibri"/>
@@ -2504,7 +2504,7 @@
         <w:pStyle w:val="Ttulo2"/>
         <w:spacing w:after="80"/>
       </w:pPr>
-      <w:bookmarkStart w:id="7" w:name="_Toc242976719"/>
+      <w:bookmarkStart w:id="7" w:name="_Toc242977365"/>
       <w:r>
         <w:rPr>
           <w:rFonts w:ascii="Calibri" w:hAnsi="Calibri"/>
@@ -2627,7 +2627,7 @@
         <w:pStyle w:val="Ttulo2"/>
         <w:spacing w:after="80"/>
       </w:pPr>
-      <w:bookmarkStart w:id="8" w:name="_Toc242976720"/>
+      <w:bookmarkStart w:id="8" w:name="_Toc242977366"/>
       <w:r>
         <w:rPr>
           <w:rFonts w:ascii="Calibri" w:hAnsi="Calibri"/>
@@ -3323,7 +3323,7 @@
         <w:pStyle w:val="Ttulo2"/>
         <w:spacing w:after="80"/>
       </w:pPr>
-      <w:bookmarkStart w:id="9" w:name="_Toc242976721"/>
+      <w:bookmarkStart w:id="9" w:name="_Toc242977367"/>
       <w:r>
         <w:rPr>
           <w:rFonts w:ascii="Calibri" w:hAnsi="Calibri"/>
@@ -3423,7 +3423,7 @@
         <w:pStyle w:val="Ttulo1"/>
         <w:spacing w:after="120"/>
       </w:pPr>
-      <w:bookmarkStart w:id="10" w:name="_Toc242976722"/>
+      <w:bookmarkStart w:id="10" w:name="_Toc242977368"/>
       <w:r>
         <w:rPr>
           <w:rFonts w:ascii="Calibri" w:hAnsi="Calibri"/>
@@ -3456,7 +3456,7 @@
         <w:pStyle w:val="Ttulo2"/>
         <w:spacing w:after="80"/>
       </w:pPr>
-      <w:bookmarkStart w:id="11" w:name="_Toc242976723"/>
+      <w:bookmarkStart w:id="11" w:name="_Toc242977369"/>
       <w:r>
         <w:rPr>
           <w:rFonts w:ascii="Calibri" w:hAnsi="Calibri"/>
@@ -3764,7 +3764,7 @@
         <w:pStyle w:val="Ttulo2"/>
         <w:spacing w:after="80"/>
       </w:pPr>
-      <w:bookmarkStart w:id="12" w:name="_Toc242976724"/>
+      <w:bookmarkStart w:id="12" w:name="_Toc242977370"/>
       <w:r>
         <w:rPr>
           <w:rFonts w:ascii="Calibri" w:hAnsi="Calibri"/>
@@ -4765,61 +4765,142 @@
         <w:t>Resultado cuantitativo: 3 de 6 procesos (50%) en nivel Deficiente y 3 de 6 procesos (50%) en nivel Parcial. 0% de procesos con soporte Bueno.</w:t>
       </w:r>
     </w:p>
-    <w:p>
-      <w:pPr>
+    <w:tbl>
+      <w:tblPr>
+        <w:tblW w:w="0" w:type="auto"/>
         <w:jc w:val="center"/>
-      </w:pPr>
-    </w:p>
-    <w:p>
-      <w:r>
-        <w:rPr>
-          <w:noProof/>
-        </w:rPr>
-        <w:drawing>
-          <wp:inline distT="0" distB="0" distL="0" distR="0">
-            <wp:extent cx="5669280" cy="3287230"/>
-            <wp:effectExtent l="0" t="0" r="0" b="0"/>
-            <wp:docPr id="1391959142" name="Picture 1391959142"/>
-            <wp:cNvGraphicFramePr>
-              <a:graphicFrameLocks xmlns:a="http://schemas.openxmlformats.org/drawingml/2006/main" noChangeAspect="1"/>
-            </wp:cNvGraphicFramePr>
-            <a:graphic xmlns:a="http://schemas.openxmlformats.org/drawingml/2006/main">
-              <a:graphicData uri="http://schemas.openxmlformats.org/drawingml/2006/picture">
-                <pic:pic xmlns:pic="http://schemas.openxmlformats.org/drawingml/2006/picture">
-                  <pic:nvPicPr>
-                    <pic:cNvPr id="0" name="vista_cooperacion.png"/>
-                    <pic:cNvPicPr/>
-                  </pic:nvPicPr>
-                  <pic:blipFill>
-                    <a:blip r:embed="rId8"/>
-                    <a:stretch>
-                      <a:fillRect/>
-                    </a:stretch>
-                  </pic:blipFill>
-                  <pic:spPr>
-                    <a:xfrm>
-                      <a:off x="0" y="0"/>
-                      <a:ext cx="5669280" cy="3287230"/>
-                    </a:xfrm>
-                    <a:prstGeom prst="rect">
-                      <a:avLst/>
-                    </a:prstGeom>
-                  </pic:spPr>
-                </pic:pic>
-              </a:graphicData>
-            </a:graphic>
-          </wp:inline>
-        </w:drawing>
-      </w:r>
-    </w:p>
-    <w:p>
-      <w:pPr>
-        <w:pStyle w:val="ImageCaption"/>
-        <w:jc w:val="center"/>
-      </w:pPr>
-      <w:r>
-        <w:t>Figura 1. Vista de cooperación proceso-aplicación de la arquitectura actual (As-Is).</w:t>
-      </w:r>
+        <w:tblLayout w:type="fixed"/>
+        <w:tblLook w:val="04A0" w:firstRow="1" w:lastRow="0" w:firstColumn="1" w:lastColumn="0" w:noHBand="0" w:noVBand="1"/>
+      </w:tblPr>
+      <w:tblGrid>
+        <w:gridCol w:w="9360"/>
+      </w:tblGrid>
+      <w:tr>
+        <w:trPr>
+          <w:jc w:val="center"/>
+        </w:trPr>
+        <w:tc>
+          <w:tcPr>
+            <w:tcW w:w="9360" w:type="dxa"/>
+            <w:tcBorders>
+              <w:left w:val="single" w:sz="24" w:space="0" w:color="1F4E79"/>
+            </w:tcBorders>
+            <w:shd w:val="clear" w:color="auto" w:fill="F4F7FB"/>
+            <w:tcMar>
+              <w:top w:w="100" w:type="dxa"/>
+              <w:left w:w="150" w:type="dxa"/>
+              <w:bottom w:w="100" w:type="dxa"/>
+              <w:right w:w="150" w:type="dxa"/>
+            </w:tcMar>
+          </w:tcPr>
+          <w:p>
+            <w:pPr>
+              <w:spacing w:before="40" w:after="60"/>
+            </w:pPr>
+            <w:r>
+              <w:rPr>
+                <w:rFonts w:ascii="Calibri" w:hAnsi="Calibri"/>
+                <w:b/>
+                <w:color w:val="16285C"/>
+                <w:sz w:val="19"/>
+              </w:rPr>
+              <w:t>📌</w:t>
+            </w:r>
+            <w:r>
+              <w:rPr>
+                <w:rFonts w:ascii="Calibri" w:hAnsi="Calibri"/>
+                <w:b/>
+                <w:color w:val="16285C"/>
+                <w:sz w:val="19"/>
+              </w:rPr>
+              <w:t xml:space="preserve"> Evidencia Verificable en GitHub · Vista de Cooperación Proceso-Aplicación (As-Is)</w:t>
+            </w:r>
+            <w:r>
+              <w:rPr>
+                <w:rFonts w:ascii="Calibri" w:hAnsi="Calibri"/>
+                <w:b/>
+                <w:color w:val="16285C"/>
+                <w:sz w:val="19"/>
+              </w:rPr>
+              <w:br/>
+            </w:r>
+            <w:r>
+              <w:rPr>
+                <w:rFonts w:ascii="Calibri" w:hAnsi="Calibri"/>
+                <w:color w:val="475569"/>
+                <w:sz w:val="17"/>
+              </w:rPr>
+              <w:t>Artefac</w:t>
+            </w:r>
+            <w:r>
+              <w:rPr>
+                <w:rFonts w:ascii="Calibri" w:hAnsi="Calibri"/>
+                <w:color w:val="475569"/>
+                <w:sz w:val="17"/>
+              </w:rPr>
+              <w:t>to en repositorio: docs/evidencias/S10/graficos/vista_cooperacion.png</w:t>
+            </w:r>
+            <w:r>
+              <w:rPr>
+                <w:rFonts w:ascii="Calibri" w:hAnsi="Calibri"/>
+                <w:color w:val="475569"/>
+                <w:sz w:val="17"/>
+              </w:rPr>
+              <w:br/>
+            </w:r>
+            <w:r>
+              <w:rPr>
+                <w:rFonts w:ascii="Calibri" w:hAnsi="Calibri"/>
+                <w:b/>
+                <w:color w:val="0F172A"/>
+                <w:sz w:val="17"/>
+              </w:rPr>
+              <w:t xml:space="preserve">URL oficial de verificación (Tag taller-10): </w:t>
+            </w:r>
+            <w:r>
+              <w:rPr>
+                <w:rFonts w:ascii="Calibri" w:hAnsi="Calibri"/>
+                <w:b/>
+                <w:color w:val="0E7490"/>
+                <w:sz w:val="17"/>
+              </w:rPr>
+              <w:t>https://github.com/GianfrancoArocutipa/Taller10_Empresa_01_Exportadora/tree/taller-10/docs/evidencias/S10/graficos/vista_cooperacion.png</w:t>
+            </w:r>
+            <w:r>
+              <w:rPr>
+                <w:rFonts w:ascii="Calibri" w:hAnsi="Calibri"/>
+                <w:b/>
+                <w:color w:val="0E7490"/>
+                <w:sz w:val="17"/>
+              </w:rPr>
+              <w:br/>
+            </w:r>
+            <w:r>
+              <w:rPr>
+                <w:rFonts w:ascii="Calibri" w:hAnsi="Calibri"/>
+                <w:i/>
+                <w:color w:val="334155"/>
+                <w:sz w:val="17"/>
+              </w:rPr>
+              <w:t>Descripción técnica: Matriz visual de evaluación de cobertura que evidencia 3 procesos en estado Deficiente (50%) y 3 en estado Parcial (50%). Conforme a las directrices de la guía, la evidencia visual se verifica en el enlace oficial del repositorio (Anex</w:t>
+            </w:r>
+            <w:r>
+              <w:rPr>
+                <w:rFonts w:ascii="Calibri" w:hAnsi="Calibri"/>
+                <w:i/>
+                <w:color w:val="334155"/>
+                <w:sz w:val="17"/>
+              </w:rPr>
+              <w:t>o B: anexos/anexo_B_vista_proceso_aplicacion.png).</w:t>
+            </w:r>
+          </w:p>
+        </w:tc>
+      </w:tr>
+    </w:tbl>
+    <w:p>
+      <w:pPr>
+        <w:spacing w:after="80"/>
+      </w:pPr>
     </w:p>
     <w:p>
       <w:pPr>
@@ -4831,15 +4912,7 @@
           <w:color w:val="334155"/>
           <w:sz w:val="20"/>
         </w:rPr>
-        <w:t xml:space="preserve">B.5 </w:t>
-      </w:r>
-      <w:r>
-        <w:rPr>
-          <w:rFonts w:ascii="Calibri" w:hAnsi="Calibri"/>
-          <w:color w:val="334155"/>
-          <w:sz w:val="20"/>
-        </w:rPr>
-        <w:t>Estructura de la Información (Catálogo de Entidades de Datos):</w:t>
+        <w:t>B.5 Estructura de la Información (Catálogo de Entidades de Datos):</w:t>
       </w:r>
     </w:p>
     <w:p>
@@ -4898,7 +4971,16 @@
                 <w:color w:val="FFFFFF"/>
                 <w:sz w:val="18"/>
               </w:rPr>
-              <w:t>Entidad</w:t>
+              <w:t>En</w:t>
+            </w:r>
+            <w:r>
+              <w:rPr>
+                <w:rFonts w:ascii="Calibri" w:hAnsi="Calibri"/>
+                <w:b/>
+                <w:color w:val="FFFFFF"/>
+                <w:sz w:val="18"/>
+              </w:rPr>
+              <w:t>tidad</w:t>
             </w:r>
           </w:p>
         </w:tc>
@@ -5292,7 +5374,14 @@
                 <w:rFonts w:ascii="Calibri" w:hAnsi="Calibri"/>
                 <w:sz w:val="15"/>
               </w:rPr>
-              <w:t>ERP Proveedores, Excel campo, Papel</w:t>
+              <w:t xml:space="preserve">ERP Proveedores, Excel </w:t>
+            </w:r>
+            <w:r>
+              <w:rPr>
+                <w:rFonts w:ascii="Calibri" w:hAnsi="Calibri"/>
+                <w:sz w:val="15"/>
+              </w:rPr>
+              <w:t>campo, Papel</w:t>
             </w:r>
           </w:p>
         </w:tc>
@@ -5538,7 +5627,14 @@
                 <w:rFonts w:ascii="Calibri" w:hAnsi="Calibri"/>
                 <w:sz w:val="15"/>
               </w:rPr>
-              <w:t>520 trabajadores de campaña sin registro.</w:t>
+              <w:t>520 trabajadores de campaña sin reg</w:t>
+            </w:r>
+            <w:r>
+              <w:rPr>
+                <w:rFonts w:ascii="Calibri" w:hAnsi="Calibri"/>
+                <w:sz w:val="15"/>
+              </w:rPr>
+              <w:t>istro.</w:t>
             </w:r>
           </w:p>
         </w:tc>
@@ -5624,28 +5720,53 @@
                 <w:rFonts w:ascii="Calibri" w:hAnsi="Calibri"/>
                 <w:sz w:val="15"/>
               </w:rPr>
-              <w:t xml:space="preserve">ERP </w:t>
-            </w:r>
+              <w:t>ERP Ventas, Correo, Documentos aduana</w:t>
+            </w:r>
+          </w:p>
+        </w:tc>
+        <w:tc>
+          <w:tcPr>
+            <w:tcW w:w="1296" w:type="dxa"/>
+            <w:tcMar>
+              <w:top w:w="60" w:type="dxa"/>
+              <w:left w:w="80" w:type="dxa"/>
+              <w:bottom w:w="60" w:type="dxa"/>
+              <w:right w:w="80" w:type="dxa"/>
+            </w:tcMar>
+          </w:tcPr>
+          <w:p>
             <w:r>
               <w:rPr>
                 <w:rFonts w:ascii="Calibri" w:hAnsi="Calibri"/>
                 <w:sz w:val="15"/>
               </w:rPr>
-              <w:t xml:space="preserve">Ventas, Correo, </w:t>
-            </w:r>
+              <w:t>14 / — / 22</w:t>
+            </w:r>
+          </w:p>
+        </w:tc>
+        <w:tc>
+          <w:tcPr>
+            <w:tcW w:w="1008" w:type="dxa"/>
+            <w:tcMar>
+              <w:top w:w="60" w:type="dxa"/>
+              <w:left w:w="80" w:type="dxa"/>
+              <w:bottom w:w="60" w:type="dxa"/>
+              <w:right w:w="80" w:type="dxa"/>
+            </w:tcMar>
+          </w:tcPr>
+          <w:p>
             <w:r>
               <w:rPr>
                 <w:rFonts w:ascii="Calibri" w:hAnsi="Calibri"/>
                 <w:sz w:val="15"/>
               </w:rPr>
-              <w:lastRenderedPageBreak/>
-              <w:t>Documentos aduana</w:t>
-            </w:r>
-          </w:p>
-        </w:tc>
-        <w:tc>
-          <w:tcPr>
-            <w:tcW w:w="1296" w:type="dxa"/>
+              <w:t>ERP Ventas</w:t>
+            </w:r>
+          </w:p>
+        </w:tc>
+        <w:tc>
+          <w:tcPr>
+            <w:tcW w:w="1152" w:type="dxa"/>
             <w:tcMar>
               <w:top w:w="60" w:type="dxa"/>
               <w:left w:w="80" w:type="dxa"/>
@@ -5659,14 +5780,13 @@
                 <w:rFonts w:ascii="Calibri" w:hAnsi="Calibri"/>
                 <w:sz w:val="15"/>
               </w:rPr>
-              <w:lastRenderedPageBreak/>
-              <w:t>14 / — / 22</w:t>
-            </w:r>
-          </w:p>
-        </w:tc>
-        <w:tc>
-          <w:tcPr>
-            <w:tcW w:w="1008" w:type="dxa"/>
+              <w:t>Gerencia Gral.</w:t>
+            </w:r>
+          </w:p>
+        </w:tc>
+        <w:tc>
+          <w:tcPr>
+            <w:tcW w:w="1872" w:type="dxa"/>
             <w:tcMar>
               <w:top w:w="60" w:type="dxa"/>
               <w:left w:w="80" w:type="dxa"/>
@@ -5680,13 +5800,13 @@
                 <w:rFonts w:ascii="Calibri" w:hAnsi="Calibri"/>
                 <w:sz w:val="15"/>
               </w:rPr>
-              <w:t>ERP Ventas</w:t>
-            </w:r>
-          </w:p>
-        </w:tc>
-        <w:tc>
-          <w:tcPr>
-            <w:tcW w:w="1152" w:type="dxa"/>
+              <w:t>Condiciones comerciales residen en correos.</w:t>
+            </w:r>
+          </w:p>
+        </w:tc>
+        <w:tc>
+          <w:tcPr>
+            <w:tcW w:w="864" w:type="dxa"/>
             <w:tcMar>
               <w:top w:w="60" w:type="dxa"/>
               <w:left w:w="80" w:type="dxa"/>
@@ -5700,13 +5820,13 @@
                 <w:rFonts w:ascii="Calibri" w:hAnsi="Calibri"/>
                 <w:sz w:val="15"/>
               </w:rPr>
-              <w:t>Gerencia Gral.</w:t>
-            </w:r>
-          </w:p>
-        </w:tc>
-        <w:tc>
-          <w:tcPr>
-            <w:tcW w:w="1872" w:type="dxa"/>
+              <w:t>Confidencial</w:t>
+            </w:r>
+          </w:p>
+        </w:tc>
+        <w:tc>
+          <w:tcPr>
+            <w:tcW w:w="864" w:type="dxa"/>
             <w:tcMar>
               <w:top w:w="60" w:type="dxa"/>
               <w:left w:w="80" w:type="dxa"/>
@@ -5720,73 +5840,7 @@
                 <w:rFonts w:ascii="Calibri" w:hAnsi="Calibri"/>
                 <w:sz w:val="15"/>
               </w:rPr>
-              <w:t xml:space="preserve">Condiciones comerciales </w:t>
-            </w:r>
-            <w:r>
-              <w:rPr>
-                <w:rFonts w:ascii="Calibri" w:hAnsi="Calibri"/>
-                <w:sz w:val="15"/>
-              </w:rPr>
-              <w:lastRenderedPageBreak/>
-              <w:t>residen en correos.</w:t>
-            </w:r>
-          </w:p>
-        </w:tc>
-        <w:tc>
-          <w:tcPr>
-            <w:tcW w:w="864" w:type="dxa"/>
-            <w:tcMar>
-              <w:top w:w="60" w:type="dxa"/>
-              <w:left w:w="80" w:type="dxa"/>
-              <w:bottom w:w="60" w:type="dxa"/>
-              <w:right w:w="80" w:type="dxa"/>
-            </w:tcMar>
-          </w:tcPr>
-          <w:p>
-            <w:r>
-              <w:rPr>
-                <w:rFonts w:ascii="Calibri" w:hAnsi="Calibri"/>
-                <w:sz w:val="15"/>
-              </w:rPr>
-              <w:lastRenderedPageBreak/>
-              <w:t>Confidenci</w:t>
-            </w:r>
-            <w:r>
-              <w:rPr>
-                <w:rFonts w:ascii="Calibri" w:hAnsi="Calibri"/>
-                <w:sz w:val="15"/>
-              </w:rPr>
-              <w:lastRenderedPageBreak/>
-              <w:t>al</w:t>
-            </w:r>
-          </w:p>
-        </w:tc>
-        <w:tc>
-          <w:tcPr>
-            <w:tcW w:w="864" w:type="dxa"/>
-            <w:tcMar>
-              <w:top w:w="60" w:type="dxa"/>
-              <w:left w:w="80" w:type="dxa"/>
-              <w:bottom w:w="60" w:type="dxa"/>
-              <w:right w:w="80" w:type="dxa"/>
-            </w:tcMar>
-          </w:tcPr>
-          <w:p>
-            <w:r>
-              <w:rPr>
-                <w:rFonts w:ascii="Calibri" w:hAnsi="Calibri"/>
-                <w:sz w:val="15"/>
-              </w:rPr>
-              <w:lastRenderedPageBreak/>
-              <w:t xml:space="preserve">Sí </w:t>
-            </w:r>
-            <w:r>
-              <w:rPr>
-                <w:rFonts w:ascii="Calibri" w:hAnsi="Calibri"/>
-                <w:sz w:val="15"/>
-              </w:rPr>
-              <w:lastRenderedPageBreak/>
-              <w:t>(contacto)</w:t>
+              <w:t>Sí (contacto)</w:t>
             </w:r>
           </w:p>
         </w:tc>
@@ -5812,7 +5866,6 @@
                 <w:b/>
                 <w:sz w:val="15"/>
               </w:rPr>
-              <w:lastRenderedPageBreak/>
               <w:t>Pesaje</w:t>
             </w:r>
           </w:p>
@@ -5853,7 +5906,14 @@
                 <w:rFonts w:ascii="Calibri" w:hAnsi="Calibri"/>
                 <w:sz w:val="15"/>
               </w:rPr>
-              <w:t>9 800 / 9 800 / 9 150</w:t>
+              <w:t xml:space="preserve">9 800 / 9 800 / </w:t>
+            </w:r>
+            <w:r>
+              <w:rPr>
+                <w:rFonts w:ascii="Calibri" w:hAnsi="Calibri"/>
+                <w:sz w:val="15"/>
+              </w:rPr>
+              <w:t>9 150</w:t>
             </w:r>
           </w:p>
         </w:tc>
@@ -5913,14 +5973,7 @@
                 <w:rFonts w:ascii="Calibri" w:hAnsi="Calibri"/>
                 <w:sz w:val="15"/>
               </w:rPr>
-              <w:t xml:space="preserve">650 pesajes de balanza sin </w:t>
-            </w:r>
-            <w:r>
-              <w:rPr>
-                <w:rFonts w:ascii="Calibri" w:hAnsi="Calibri"/>
-                <w:sz w:val="15"/>
-              </w:rPr>
-              <w:t>transcripción a ERP.</w:t>
+              <w:t>650 pesajes de balanza sin transcripción a ERP.</w:t>
             </w:r>
           </w:p>
         </w:tc>
@@ -6172,7 +6225,14 @@
                 <w:rFonts w:ascii="Calibri" w:hAnsi="Calibri"/>
                 <w:sz w:val="15"/>
               </w:rPr>
-              <w:t>Consola web fertirriego, Excel campo</w:t>
+              <w:t xml:space="preserve">Consola web </w:t>
+            </w:r>
+            <w:r>
+              <w:rPr>
+                <w:rFonts w:ascii="Calibri" w:hAnsi="Calibri"/>
+                <w:sz w:val="15"/>
+              </w:rPr>
+              <w:t>fertirriego, Excel campo</w:t>
             </w:r>
           </w:p>
         </w:tc>
@@ -6309,7 +6369,7 @@
           <w:color w:val="334155"/>
           <w:sz w:val="20"/>
         </w:rPr>
-        <w:t>Métricas clave de la capa de datos: 5 de 7 entidades (71.4%) carecen de fuente autoritativa única y 5 de 7 entidades (71.4%) no tienen un dueño asignado formalmente por cargo. Asimi</w:t>
+        <w:t>Métricas clave de la capa de datos: 5 de 7 entidades (71.4%) carecen de fuente autoritativa única y 5 de 7 entidades (71.4%) no</w:t>
       </w:r>
       <w:r>
         <w:rPr>
@@ -6318,84 +6378,169 @@
           <w:color w:val="334155"/>
           <w:sz w:val="20"/>
         </w:rPr>
-        <w:t>smo, el 100% de los datos personales de trabajadores de campaña se manejan de manera informal sin medidas de la Ley N° 29733.</w:t>
-      </w:r>
-    </w:p>
-    <w:p>
-      <w:pPr>
+        <w:t xml:space="preserve"> tienen un dueño asignado formalmente por cargo. Asimismo, el 100% de los datos personales de trabajadores de campaña se manejan de manera informal sin medidas de la Ley N° 29733.</w:t>
+      </w:r>
+    </w:p>
+    <w:tbl>
+      <w:tblPr>
+        <w:tblW w:w="0" w:type="auto"/>
         <w:jc w:val="center"/>
-      </w:pPr>
-    </w:p>
-    <w:p>
-      <w:r>
-        <w:rPr>
-          <w:noProof/>
-        </w:rPr>
-        <w:drawing>
-          <wp:inline distT="0" distB="0" distL="0" distR="0">
-            <wp:extent cx="5669280" cy="3911364"/>
-            <wp:effectExtent l="0" t="0" r="0" b="0"/>
-            <wp:docPr id="1391959143" name="Picture 1391959143"/>
-            <wp:cNvGraphicFramePr>
-              <a:graphicFrameLocks xmlns:a="http://schemas.openxmlformats.org/drawingml/2006/main" noChangeAspect="1"/>
-            </wp:cNvGraphicFramePr>
-            <a:graphic xmlns:a="http://schemas.openxmlformats.org/drawingml/2006/main">
-              <a:graphicData uri="http://schemas.openxmlformats.org/drawingml/2006/picture">
-                <pic:pic xmlns:pic="http://schemas.openxmlformats.org/drawingml/2006/picture">
-                  <pic:nvPicPr>
-                    <pic:cNvPr id="0" name="vista_actual_3capas.png"/>
-                    <pic:cNvPicPr/>
-                  </pic:nvPicPr>
-                  <pic:blipFill>
-                    <a:blip r:embed="rId9"/>
-                    <a:stretch>
-                      <a:fillRect/>
-                    </a:stretch>
-                  </pic:blipFill>
-                  <pic:spPr>
-                    <a:xfrm>
-                      <a:off x="0" y="0"/>
-                      <a:ext cx="5669280" cy="3911364"/>
-                    </a:xfrm>
-                    <a:prstGeom prst="rect">
-                      <a:avLst/>
-                    </a:prstGeom>
-                  </pic:spPr>
-                </pic:pic>
-              </a:graphicData>
-            </a:graphic>
-          </wp:inline>
-        </w:drawing>
-      </w:r>
-    </w:p>
-    <w:p>
-      <w:pPr>
-        <w:pStyle w:val="ImageCaption"/>
-        <w:jc w:val="center"/>
-      </w:pPr>
-      <w:r>
-        <w:t>Figura 2. Modelo de la arquitectura actual (As-Is) en tres capas con hojas de cálculo operativas.</w:t>
-      </w:r>
+        <w:tblLayout w:type="fixed"/>
+        <w:tblLook w:val="04A0" w:firstRow="1" w:lastRow="0" w:firstColumn="1" w:lastColumn="0" w:noHBand="0" w:noVBand="1"/>
+      </w:tblPr>
+      <w:tblGrid>
+        <w:gridCol w:w="9360"/>
+      </w:tblGrid>
+      <w:tr>
+        <w:trPr>
+          <w:jc w:val="center"/>
+        </w:trPr>
+        <w:tc>
+          <w:tcPr>
+            <w:tcW w:w="9360" w:type="dxa"/>
+            <w:tcBorders>
+              <w:left w:val="single" w:sz="24" w:space="0" w:color="1F4E79"/>
+            </w:tcBorders>
+            <w:shd w:val="clear" w:color="auto" w:fill="F4F7FB"/>
+            <w:tcMar>
+              <w:top w:w="100" w:type="dxa"/>
+              <w:left w:w="150" w:type="dxa"/>
+              <w:bottom w:w="100" w:type="dxa"/>
+              <w:right w:w="150" w:type="dxa"/>
+            </w:tcMar>
+          </w:tcPr>
+          <w:p>
+            <w:pPr>
+              <w:spacing w:before="40" w:after="60"/>
+            </w:pPr>
+            <w:r>
+              <w:rPr>
+                <w:rFonts w:ascii="Calibri" w:hAnsi="Calibri"/>
+                <w:b/>
+                <w:color w:val="16285C"/>
+                <w:sz w:val="19"/>
+              </w:rPr>
+              <w:t>📌</w:t>
+            </w:r>
+            <w:r>
+              <w:rPr>
+                <w:rFonts w:ascii="Calibri" w:hAnsi="Calibri"/>
+                <w:b/>
+                <w:color w:val="16285C"/>
+                <w:sz w:val="19"/>
+              </w:rPr>
+              <w:t xml:space="preserve"> Evidencia Verificable en GitHub · Modelo de Arquitectura Actual en Tres </w:t>
+            </w:r>
+            <w:r>
+              <w:rPr>
+                <w:rFonts w:ascii="Calibri" w:hAnsi="Calibri"/>
+                <w:b/>
+                <w:color w:val="16285C"/>
+                <w:sz w:val="19"/>
+              </w:rPr>
+              <w:t>Capas (As-Is)</w:t>
+            </w:r>
+            <w:r>
+              <w:rPr>
+                <w:rFonts w:ascii="Calibri" w:hAnsi="Calibri"/>
+                <w:b/>
+                <w:color w:val="16285C"/>
+                <w:sz w:val="19"/>
+              </w:rPr>
+              <w:br/>
+            </w:r>
+            <w:r>
+              <w:rPr>
+                <w:rFonts w:ascii="Calibri" w:hAnsi="Calibri"/>
+                <w:color w:val="475569"/>
+                <w:sz w:val="17"/>
+              </w:rPr>
+              <w:lastRenderedPageBreak/>
+              <w:t>Artefacto en repositorio: docs/evidencias/S10/graficos/vista_actual_3capas.png</w:t>
+            </w:r>
+            <w:r>
+              <w:rPr>
+                <w:rFonts w:ascii="Calibri" w:hAnsi="Calibri"/>
+                <w:color w:val="475569"/>
+                <w:sz w:val="17"/>
+              </w:rPr>
+              <w:br/>
+            </w:r>
+            <w:r>
+              <w:rPr>
+                <w:rFonts w:ascii="Calibri" w:hAnsi="Calibri"/>
+                <w:b/>
+                <w:color w:val="0F172A"/>
+                <w:sz w:val="17"/>
+              </w:rPr>
+              <w:t xml:space="preserve">URL oficial de verificación (Tag taller-10): </w:t>
+            </w:r>
+            <w:r>
+              <w:rPr>
+                <w:rFonts w:ascii="Calibri" w:hAnsi="Calibri"/>
+                <w:b/>
+                <w:color w:val="0E7490"/>
+                <w:sz w:val="17"/>
+              </w:rPr>
+              <w:t>https://github.com/GianfrancoArocutipa/Taller10_Empresa_01_Exportadora/tree/taller-10/docs/evidencias/S10/graficos/vis</w:t>
+            </w:r>
+            <w:r>
+              <w:rPr>
+                <w:rFonts w:ascii="Calibri" w:hAnsi="Calibri"/>
+                <w:b/>
+                <w:color w:val="0E7490"/>
+                <w:sz w:val="17"/>
+              </w:rPr>
+              <w:t>ta_actual_3capas.png</w:t>
+            </w:r>
+            <w:r>
+              <w:rPr>
+                <w:rFonts w:ascii="Calibri" w:hAnsi="Calibri"/>
+                <w:b/>
+                <w:color w:val="0E7490"/>
+                <w:sz w:val="17"/>
+              </w:rPr>
+              <w:br/>
+            </w:r>
+            <w:r>
+              <w:rPr>
+                <w:rFonts w:ascii="Calibri" w:hAnsi="Calibri"/>
+                <w:i/>
+                <w:color w:val="334155"/>
+                <w:sz w:val="17"/>
+              </w:rPr>
+              <w:t xml:space="preserve">Descripción técnica: Modelo completo en ArchiMate 3.2 que formaliza en la capa de aplicación los tres libros de hojas de cálculo operativos (Trazabilidad, Costo/Tn y Riego), el Access 2014 sin soporte y la infraestructura física. </w:t>
+            </w:r>
+            <w:r>
+              <w:rPr>
+                <w:rFonts w:ascii="Calibri" w:hAnsi="Calibri"/>
+                <w:i/>
+                <w:color w:val="334155"/>
+                <w:sz w:val="17"/>
+              </w:rPr>
+              <w:t>Archivo nativo Archi: anexos/anexo_A_modelo_arquitectura.archimate</w:t>
+            </w:r>
+          </w:p>
+        </w:tc>
+      </w:tr>
+    </w:tbl>
+    <w:p>
+      <w:pPr>
+        <w:spacing w:after="80"/>
+      </w:pPr>
     </w:p>
     <w:p>
       <w:pPr>
         <w:pStyle w:val="Ttulo2"/>
         <w:spacing w:after="80"/>
       </w:pPr>
-      <w:bookmarkStart w:id="13" w:name="_Toc242976725"/>
+      <w:bookmarkStart w:id="13" w:name="_Toc242977371"/>
       <w:r>
         <w:rPr>
           <w:rFonts w:ascii="Calibri" w:hAnsi="Calibri"/>
           <w:color w:val="1F4E79"/>
         </w:rPr>
-        <w:t xml:space="preserve">Paso C — Modelar la </w:t>
-      </w:r>
-      <w:r>
-        <w:rPr>
-          <w:rFonts w:ascii="Calibri" w:hAnsi="Calibri"/>
-          <w:color w:val="1F4E79"/>
-        </w:rPr>
-        <w:t>arquitectura objetivo (To-Be)</w:t>
+        <w:t>Paso C — Modelar la arquitectura objetivo (To-Be)</w:t>
       </w:r>
       <w:bookmarkEnd w:id="13"/>
     </w:p>
@@ -6428,7 +6573,15 @@
           <w:color w:val="334155"/>
           <w:sz w:val="20"/>
         </w:rPr>
-        <w:t>Diseñar la arquitectura futura (To-Be) derivándola estrictamente de la visión institucional, los objetivos de TI, las capacidades requeridas y las estrategias del FODA cruzado.</w:t>
+        <w:t>Diseñar la arquitectura futura (To-Be) derivándola estrictamente de la visión institucional, los objetivos de TI, las c</w:t>
+      </w:r>
+      <w:r>
+        <w:rPr>
+          <w:rFonts w:ascii="Calibri" w:hAnsi="Calibri"/>
+          <w:color w:val="334155"/>
+          <w:sz w:val="20"/>
+        </w:rPr>
+        <w:t>apacidades requeridas y las estrategias del FODA cruzado.</w:t>
       </w:r>
     </w:p>
     <w:p>
@@ -6460,15 +6613,7 @@
           <w:color w:val="334155"/>
           <w:sz w:val="20"/>
         </w:rPr>
-        <w:t>Construcció</w:t>
-      </w:r>
-      <w:r>
-        <w:rPr>
-          <w:rFonts w:ascii="Calibri" w:hAnsi="Calibri"/>
-          <w:color w:val="334155"/>
-          <w:sz w:val="20"/>
-        </w:rPr>
-        <w:t>n de la matriz de cambios por capa y modelado del estado objetivo en ArchiMate 3.2, documentado en '05_seccion_arquitectura.md'.</w:t>
+        <w:t>Construcción de la matriz de cambios por capa y modelado del estado objetivo en ArchiMate 3.2, documentado en '05_seccion_arquitectura.md'.</w:t>
       </w:r>
     </w:p>
     <w:p>
@@ -6500,7 +6645,15 @@
           <w:color w:val="334155"/>
           <w:sz w:val="20"/>
         </w:rPr>
-        <w:t>Derivación trazada y especificación de cambios estructurales:</w:t>
+        <w:t>Derivació</w:t>
+      </w:r>
+      <w:r>
+        <w:rPr>
+          <w:rFonts w:ascii="Calibri" w:hAnsi="Calibri"/>
+          <w:color w:val="334155"/>
+          <w:sz w:val="20"/>
+        </w:rPr>
+        <w:t>n trazada y especificación de cambios estructurales:</w:t>
       </w:r>
     </w:p>
     <w:p>
@@ -6522,7 +6675,7 @@
           <w:color w:val="334155"/>
           <w:sz w:val="20"/>
         </w:rPr>
-        <w:t xml:space="preserve">• Derivación </w:t>
+        <w:t>• Derivación Estratégica: El objetivo declarado de 'reducir el cierre de trazabilidad de 11 días a menos de 2 horas' exige reemplazar el Access 2014 y las hojas de cálculo por un Módulo d</w:t>
       </w:r>
       <w:r>
         <w:rPr>
@@ -6530,24 +6683,7 @@
           <w:color w:val="334155"/>
           <w:sz w:val="20"/>
         </w:rPr>
-        <w:t xml:space="preserve">Estratégica: El objetivo declarado de 'reducir el cierre de trazabilidad de 11 días a menos de 2 horas' exige reemplazar el Access 2014 y las hojas de cálculo por un Módulo de Trazabilidad y </w:t>
-      </w:r>
-      <w:r>
-        <w:rPr>
-          <w:rFonts w:ascii="Calibri" w:hAnsi="Calibri"/>
-          <w:color w:val="334155"/>
-          <w:sz w:val="20"/>
-        </w:rPr>
-        <w:lastRenderedPageBreak/>
-        <w:t>Producción (MES) integrado nativamente al ERP. La exigencia de in</w:t>
-      </w:r>
-      <w:r>
-        <w:rPr>
-          <w:rFonts w:ascii="Calibri" w:hAnsi="Calibri"/>
-          <w:color w:val="334155"/>
-          <w:sz w:val="20"/>
-        </w:rPr>
-        <w:t>ocuidad SENASA y la Ley 29733 imponen la digitalización del padrón de productores y el registro de trabajadores.</w:t>
+        <w:t>e Trazabilidad y Producción (MES) integrado nativamente al ERP. La exigencia de inocuidad SENASA y la Ley 29733 imponen la digitalización del padrón de productores y el registro de trabajadores.</w:t>
       </w:r>
     </w:p>
     <w:tbl>
@@ -6667,7 +6803,16 @@
                 <w:color w:val="FFFFFF"/>
                 <w:sz w:val="18"/>
               </w:rPr>
-              <w:t>Origen del Cambio</w:t>
+              <w:t>Origen</w:t>
+            </w:r>
+            <w:r>
+              <w:rPr>
+                <w:rFonts w:ascii="Calibri" w:hAnsi="Calibri"/>
+                <w:b/>
+                <w:color w:val="FFFFFF"/>
+                <w:sz w:val="18"/>
+              </w:rPr>
+              <w:t xml:space="preserve"> del Cambio</w:t>
             </w:r>
           </w:p>
         </w:tc>
@@ -6733,14 +6878,7 @@
                 <w:rFonts w:ascii="Calibri" w:hAnsi="Calibri"/>
                 <w:sz w:val="16"/>
               </w:rPr>
-              <w:t>Recepción y pesaje automat</w:t>
-            </w:r>
-            <w:r>
-              <w:rPr>
-                <w:rFonts w:ascii="Calibri" w:hAnsi="Calibri"/>
-                <w:sz w:val="16"/>
-              </w:rPr>
-              <w:t>izado con sensores IoT y escáner</w:t>
+              <w:t>Recepción y pesaje automatizado con sensores IoT y escáner</w:t>
             </w:r>
           </w:p>
         </w:tc>
@@ -6912,14 +7050,7 @@
                 <w:rFonts w:ascii="Calibri" w:hAnsi="Calibri"/>
                 <w:sz w:val="16"/>
               </w:rPr>
-              <w:t xml:space="preserve">Maestro </w:t>
-            </w:r>
-            <w:r>
-              <w:rPr>
-                <w:rFonts w:ascii="Calibri" w:hAnsi="Calibri"/>
-                <w:sz w:val="16"/>
-              </w:rPr>
-              <w:t>Único de Lotes en ERP como fuente autoritativa</w:t>
+              <w:t>Maestro Único de Lotes en ERP como fuente autoritativa</w:t>
             </w:r>
           </w:p>
         </w:tc>
@@ -7005,7 +7136,14 @@
                 <w:rFonts w:ascii="Calibri" w:hAnsi="Calibri"/>
                 <w:sz w:val="16"/>
               </w:rPr>
-              <w:t>Padrón unificado de productores integrado al módulo de compras</w:t>
+              <w:t>Padrón unificado de productores integrado</w:t>
+            </w:r>
+            <w:r>
+              <w:rPr>
+                <w:rFonts w:ascii="Calibri" w:hAnsi="Calibri"/>
+                <w:sz w:val="16"/>
+              </w:rPr>
+              <w:t xml:space="preserve"> al módulo de compras</w:t>
             </w:r>
           </w:p>
         </w:tc>
@@ -7071,14 +7209,7 @@
                 <w:rFonts w:ascii="Calibri" w:hAnsi="Calibri"/>
                 <w:sz w:val="16"/>
               </w:rPr>
-              <w:t>520 trabajadores de campaña s</w:t>
-            </w:r>
-            <w:r>
-              <w:rPr>
-                <w:rFonts w:ascii="Calibri" w:hAnsi="Calibri"/>
-                <w:sz w:val="16"/>
-              </w:rPr>
-              <w:t>in registro</w:t>
+              <w:t>520 trabajadores de campaña sin registro</w:t>
             </w:r>
           </w:p>
         </w:tc>
@@ -7184,7 +7315,14 @@
                 <w:rFonts w:ascii="Calibri" w:hAnsi="Calibri"/>
                 <w:sz w:val="16"/>
               </w:rPr>
-              <w:t>Módulo Integrado de Trazabilidad y Producción (MES) en ERP</w:t>
+              <w:t>Módulo Integra</w:t>
+            </w:r>
+            <w:r>
+              <w:rPr>
+                <w:rFonts w:ascii="Calibri" w:hAnsi="Calibri"/>
+                <w:sz w:val="16"/>
+              </w:rPr>
+              <w:t>do de Trazabilidad y Producción (MES) en ERP</w:t>
             </w:r>
           </w:p>
         </w:tc>
@@ -7336,7 +7474,14 @@
                 <w:rFonts w:ascii="Calibri" w:hAnsi="Calibri"/>
                 <w:sz w:val="16"/>
               </w:rPr>
-              <w:t>Costeo por tonelada en Excel de Finanzas</w:t>
+              <w:t xml:space="preserve">Costeo por tonelada en </w:t>
+            </w:r>
+            <w:r>
+              <w:rPr>
+                <w:rFonts w:ascii="Calibri" w:hAnsi="Calibri"/>
+                <w:sz w:val="16"/>
+              </w:rPr>
+              <w:t>Excel de Finanzas</w:t>
             </w:r>
           </w:p>
         </w:tc>
@@ -7376,14 +7521,7 @@
                 <w:rFonts w:ascii="Calibri" w:hAnsi="Calibri"/>
                 <w:sz w:val="16"/>
               </w:rPr>
-              <w:t xml:space="preserve">Estrategia E-03 </w:t>
-            </w:r>
-            <w:r>
-              <w:rPr>
-                <w:rFonts w:ascii="Calibri" w:hAnsi="Calibri"/>
-                <w:sz w:val="16"/>
-              </w:rPr>
-              <w:t>(Control de rentabilidad)</w:t>
+              <w:t>Estrategia E-03 (Control de rentabilidad)</w:t>
             </w:r>
           </w:p>
         </w:tc>
@@ -7515,7 +7653,14 @@
                 <w:rFonts w:ascii="Calibri" w:hAnsi="Calibri"/>
                 <w:sz w:val="16"/>
               </w:rPr>
-              <w:t>Servidor único con UPS de 10 minutos</w:t>
+              <w:t>Servidor</w:t>
+            </w:r>
+            <w:r>
+              <w:rPr>
+                <w:rFonts w:ascii="Calibri" w:hAnsi="Calibri"/>
+                <w:sz w:val="16"/>
+              </w:rPr>
+              <w:t xml:space="preserve"> único con UPS de 10 minutos</w:t>
             </w:r>
           </w:p>
         </w:tc>
@@ -7535,14 +7680,7 @@
                 <w:rFonts w:ascii="Calibri" w:hAnsi="Calibri"/>
                 <w:sz w:val="16"/>
               </w:rPr>
-              <w:t>Infraestructura híbrida con RAID y réplica inmutable en nu</w:t>
-            </w:r>
-            <w:r>
-              <w:rPr>
-                <w:rFonts w:ascii="Calibri" w:hAnsi="Calibri"/>
-                <w:sz w:val="16"/>
-              </w:rPr>
-              <w:t>be</w:t>
+              <w:t>Infraestructura híbrida con RAID y réplica inmutable en nube</w:t>
             </w:r>
           </w:p>
         </w:tc>
@@ -7674,7 +7812,16 @@
                 <w:b/>
                 <w:sz w:val="16"/>
               </w:rPr>
-              <w:t>Tecnología</w:t>
+              <w:lastRenderedPageBreak/>
+              <w:t>Tecnolo</w:t>
+            </w:r>
+            <w:r>
+              <w:rPr>
+                <w:rFonts w:ascii="Calibri" w:hAnsi="Calibri"/>
+                <w:b/>
+                <w:sz w:val="16"/>
+              </w:rPr>
+              <w:t>gía</w:t>
             </w:r>
           </w:p>
         </w:tc>
@@ -7714,14 +7861,7 @@
                 <w:rFonts w:ascii="Calibri" w:hAnsi="Calibri"/>
                 <w:sz w:val="16"/>
               </w:rPr>
-              <w:t xml:space="preserve">VLANs segmentadas (Planta/Oficina/DMZ) y enlace </w:t>
-            </w:r>
-            <w:r>
-              <w:rPr>
-                <w:rFonts w:ascii="Calibri" w:hAnsi="Calibri"/>
-                <w:sz w:val="16"/>
-              </w:rPr>
-              <w:t>redundante</w:t>
+              <w:t>VLANs segmentadas (Planta/Oficina/DMZ) y enlace redundante</w:t>
             </w:r>
           </w:p>
         </w:tc>
@@ -7742,6 +7882,137 @@
                 <w:sz w:val="16"/>
               </w:rPr>
               <w:t>COBIT DSS05 (Seguridad perimetral)</w:t>
+            </w:r>
+          </w:p>
+        </w:tc>
+      </w:tr>
+      <w:tr>
+        <w:trPr>
+          <w:jc w:val="center"/>
+        </w:trPr>
+        <w:tc>
+          <w:tcPr>
+            <w:tcW w:w="9360" w:type="dxa"/>
+            <w:gridSpan w:val="4"/>
+            <w:tcBorders>
+              <w:left w:val="single" w:sz="24" w:space="0" w:color="1F4E79"/>
+            </w:tcBorders>
+            <w:shd w:val="clear" w:color="auto" w:fill="F4F7FB"/>
+            <w:tcMar>
+              <w:top w:w="100" w:type="dxa"/>
+              <w:left w:w="150" w:type="dxa"/>
+              <w:bottom w:w="100" w:type="dxa"/>
+              <w:right w:w="150" w:type="dxa"/>
+            </w:tcMar>
+          </w:tcPr>
+          <w:p>
+            <w:pPr>
+              <w:spacing w:before="40" w:after="60"/>
+            </w:pPr>
+            <w:r>
+              <w:rPr>
+                <w:rFonts w:ascii="Calibri" w:hAnsi="Calibri"/>
+                <w:b/>
+                <w:color w:val="16285C"/>
+                <w:sz w:val="19"/>
+              </w:rPr>
+              <w:t>📌</w:t>
+            </w:r>
+            <w:r>
+              <w:rPr>
+                <w:rFonts w:ascii="Calibri" w:hAnsi="Calibri"/>
+                <w:b/>
+                <w:color w:val="16285C"/>
+                <w:sz w:val="19"/>
+              </w:rPr>
+              <w:t xml:space="preserve"> Evidencia Verificable en GitHub · Modelo de Arquitectura Objetivo en Tres Capas (To-Be)</w:t>
+            </w:r>
+            <w:r>
+              <w:rPr>
+                <w:rFonts w:ascii="Calibri" w:hAnsi="Calibri"/>
+                <w:b/>
+                <w:color w:val="16285C"/>
+                <w:sz w:val="19"/>
+              </w:rPr>
+              <w:br/>
+            </w:r>
+            <w:r>
+              <w:rPr>
+                <w:rFonts w:ascii="Calibri" w:hAnsi="Calibri"/>
+                <w:color w:val="475569"/>
+                <w:sz w:val="17"/>
+              </w:rPr>
+              <w:t xml:space="preserve">Artefacto en repositorio: </w:t>
+            </w:r>
+            <w:r>
+              <w:rPr>
+                <w:rFonts w:ascii="Calibri" w:hAnsi="Calibri"/>
+                <w:color w:val="475569"/>
+                <w:sz w:val="17"/>
+              </w:rPr>
+              <w:t>docs/evidencias/S10/graficos/vista_objetivo.png</w:t>
+            </w:r>
+            <w:r>
+              <w:rPr>
+                <w:rFonts w:ascii="Calibri" w:hAnsi="Calibri"/>
+                <w:color w:val="475569"/>
+                <w:sz w:val="17"/>
+              </w:rPr>
+              <w:br/>
+            </w:r>
+            <w:r>
+              <w:rPr>
+                <w:rFonts w:ascii="Calibri" w:hAnsi="Calibri"/>
+                <w:b/>
+                <w:color w:val="0F172A"/>
+                <w:sz w:val="17"/>
+              </w:rPr>
+              <w:t xml:space="preserve">URL oficial de verificación (Tag taller-10): </w:t>
+            </w:r>
+            <w:r>
+              <w:rPr>
+                <w:rFonts w:ascii="Calibri" w:hAnsi="Calibri"/>
+                <w:b/>
+                <w:color w:val="0E7490"/>
+                <w:sz w:val="17"/>
+              </w:rPr>
+              <w:t>https://github.com/GianfrancoArocutipa/Taller10_Empresa_01_Exportadora/tree/taller-10/docs/evidencias/S10/graficos/vista_objetivo.png</w:t>
+            </w:r>
+            <w:r>
+              <w:rPr>
+                <w:rFonts w:ascii="Calibri" w:hAnsi="Calibri"/>
+                <w:b/>
+                <w:color w:val="0E7490"/>
+                <w:sz w:val="17"/>
+              </w:rPr>
+              <w:br/>
+            </w:r>
+            <w:r>
+              <w:rPr>
+                <w:rFonts w:ascii="Calibri" w:hAnsi="Calibri"/>
+                <w:i/>
+                <w:color w:val="334155"/>
+                <w:sz w:val="17"/>
+              </w:rPr>
+              <w:t xml:space="preserve">Descripción técnica: Modelo </w:t>
+            </w:r>
+            <w:r>
+              <w:rPr>
+                <w:rFonts w:ascii="Calibri" w:hAnsi="Calibri"/>
+                <w:i/>
+                <w:color w:val="334155"/>
+                <w:sz w:val="17"/>
+              </w:rPr>
+              <w:t>objetivo que representa la modernización integral: Módulo MES de Trazabilidad, Capa de integración de servicios (APIs REST), conectividad IoT en balanza de ingreso y alta disponibilidad en nube híbrida con respaldo inmutable (Anexo D: anexos/anexo_D_arquit</w:t>
+            </w:r>
+            <w:r>
+              <w:rPr>
+                <w:rFonts w:ascii="Calibri" w:hAnsi="Calibri"/>
+                <w:i/>
+                <w:color w:val="334155"/>
+                <w:sz w:val="17"/>
+              </w:rPr>
+              <w:t>ectura_objetivo.png).</w:t>
             </w:r>
           </w:p>
         </w:tc>
@@ -7749,67 +8020,15 @@
     </w:tbl>
     <w:p>
       <w:pPr>
-        <w:jc w:val="center"/>
-      </w:pPr>
-    </w:p>
-    <w:p>
-      <w:r>
-        <w:rPr>
-          <w:noProof/>
-        </w:rPr>
-        <w:lastRenderedPageBreak/>
-        <w:drawing>
-          <wp:inline distT="0" distB="0" distL="0" distR="0">
-            <wp:extent cx="5669280" cy="3911364"/>
-            <wp:effectExtent l="0" t="0" r="0" b="0"/>
-            <wp:docPr id="1391959144" name="Picture 1391959144"/>
-            <wp:cNvGraphicFramePr>
-              <a:graphicFrameLocks xmlns:a="http://schemas.openxmlformats.org/drawingml/2006/main" noChangeAspect="1"/>
-            </wp:cNvGraphicFramePr>
-            <a:graphic xmlns:a="http://schemas.openxmlformats.org/drawingml/2006/main">
-              <a:graphicData uri="http://schemas.openxmlformats.org/drawingml/2006/picture">
-                <pic:pic xmlns:pic="http://schemas.openxmlformats.org/drawingml/2006/picture">
-                  <pic:nvPicPr>
-                    <pic:cNvPr id="0" name="vista_objetivo.png"/>
-                    <pic:cNvPicPr/>
-                  </pic:nvPicPr>
-                  <pic:blipFill>
-                    <a:blip r:embed="rId10"/>
-                    <a:stretch>
-                      <a:fillRect/>
-                    </a:stretch>
-                  </pic:blipFill>
-                  <pic:spPr>
-                    <a:xfrm>
-                      <a:off x="0" y="0"/>
-                      <a:ext cx="5669280" cy="3911364"/>
-                    </a:xfrm>
-                    <a:prstGeom prst="rect">
-                      <a:avLst/>
-                    </a:prstGeom>
-                  </pic:spPr>
-                </pic:pic>
-              </a:graphicData>
-            </a:graphic>
-          </wp:inline>
-        </w:drawing>
-      </w:r>
-    </w:p>
-    <w:p>
-      <w:pPr>
-        <w:pStyle w:val="ImageCaption"/>
-        <w:jc w:val="center"/>
-      </w:pPr>
-      <w:r>
-        <w:t>Figura 3. Modelo de la arquitectura objetivo (To-Be) en tres capas con integración de servicios y nube híbrida.</w:t>
-      </w:r>
+        <w:spacing w:after="80"/>
+      </w:pPr>
     </w:p>
     <w:p>
       <w:pPr>
         <w:pStyle w:val="Ttulo2"/>
         <w:spacing w:after="80"/>
       </w:pPr>
-      <w:bookmarkStart w:id="14" w:name="_Toc242976726"/>
+      <w:bookmarkStart w:id="14" w:name="_Toc242977372"/>
       <w:r>
         <w:rPr>
           <w:rFonts w:ascii="Calibri" w:hAnsi="Calibri"/>
@@ -7848,7 +8067,7 @@
           <w:color w:val="334155"/>
           <w:sz w:val="20"/>
         </w:rPr>
-        <w:t xml:space="preserve">Identificar la totalidad </w:t>
+        <w:t>Identificar la totalidad de brechas entre el estado actual y el objetivo, clasificarlas por capa y tipo, calcular el esfuerzo técnico y derivar los paquetes de tra</w:t>
       </w:r>
       <w:r>
         <w:rPr>
@@ -7856,7 +8075,7 @@
           <w:color w:val="334155"/>
           <w:sz w:val="20"/>
         </w:rPr>
-        <w:t>de brechas entre el estado actual y el objetivo, clasificarlas por capa y tipo, calcular el esfuerzo técnico y derivar los paquetes de trabajo respetando su secuencia lógica obligada.</w:t>
+        <w:t>bajo respetando su secuencia lógica obligada.</w:t>
       </w:r>
     </w:p>
     <w:p>
@@ -7888,7 +8107,7 @@
           <w:color w:val="334155"/>
           <w:sz w:val="20"/>
         </w:rPr>
-        <w:t>Ejecución automatizada del script en Python '05_arqu</w:t>
+        <w:t>Ejecución automatizada del script en Python '05_arquitectura/AR03_brechas.py', generando el dataset '05_arquitectura/AR03_brechas.csv' y el registro en 'docs/evidencias/S10/salidas/salida_br</w:t>
       </w:r>
       <w:r>
         <w:rPr>
@@ -7896,15 +8115,7 @@
           <w:color w:val="334155"/>
           <w:sz w:val="20"/>
         </w:rPr>
-        <w:t>itectura/AR03_brechas.py', generando el dataset '05_arquitectura/AR03_brechas.csv' y el registro en 'docs/evidencias/S10/salidas/salida_brechas.txt'. Enlace: https://github.com/GianfrancoArocutipa/Taller10_Empresa_01_Exportadora/tree/taller-10/05_arquitect</w:t>
-      </w:r>
-      <w:r>
-        <w:rPr>
-          <w:rFonts w:ascii="Calibri" w:hAnsi="Calibri"/>
-          <w:color w:val="334155"/>
-          <w:sz w:val="20"/>
-        </w:rPr>
-        <w:t>ura/AR03_brechas.py</w:t>
+        <w:t>echas.txt'. Enlace: https://github.com/GianfrancoArocutipa/Taller10_Empresa_01_Exportadora/tree/taller-10/05_arquitectura/AR03_brechas.py</w:t>
       </w:r>
     </w:p>
     <w:p>
@@ -7936,7 +8147,15 @@
           <w:color w:val="334155"/>
           <w:sz w:val="20"/>
         </w:rPr>
-        <w:t>Se detectaron 13 brechas arquitectónicas consolidadas en seis paquetes de trabajo prioritarios:</w:t>
+        <w:t>Se detectaron 13 brechas arquitectónicas consolidadas en seis paquetes de trabajo priorit</w:t>
+      </w:r>
+      <w:r>
+        <w:rPr>
+          <w:rFonts w:ascii="Calibri" w:hAnsi="Calibri"/>
+          <w:color w:val="334155"/>
+          <w:sz w:val="20"/>
+        </w:rPr>
+        <w:t>arios:</w:t>
       </w:r>
     </w:p>
     <w:tbl>
@@ -8156,14 +8375,7 @@
                 <w:rFonts w:ascii="Calibri" w:hAnsi="Calibri"/>
                 <w:sz w:val="16"/>
               </w:rPr>
-              <w:t xml:space="preserve">Gobierno y Calidad del Dato </w:t>
-            </w:r>
-            <w:r>
-              <w:rPr>
-                <w:rFonts w:ascii="Calibri" w:hAnsi="Calibri"/>
-                <w:sz w:val="16"/>
-              </w:rPr>
-              <w:t>Maestro (MDM)</w:t>
+              <w:t>Gobierno y Calidad del Dato Maestro (MDM)</w:t>
             </w:r>
           </w:p>
         </w:tc>
@@ -8309,14 +8521,7 @@
                 <w:rFonts w:ascii="Calibri" w:hAnsi="Calibri"/>
                 <w:sz w:val="16"/>
               </w:rPr>
-              <w:t xml:space="preserve">Access 2014 sin soporte; Excel de campaña en planta; PC de planta en </w:t>
-            </w:r>
-            <w:r>
-              <w:rPr>
-                <w:rFonts w:ascii="Calibri" w:hAnsi="Calibri"/>
-                <w:sz w:val="16"/>
-              </w:rPr>
-              <w:t>riesgo físico.</w:t>
+              <w:t>Access 2014 sin soporte; Excel de campaña en planta; PC de planta en riesgo físico.</w:t>
             </w:r>
           </w:p>
         </w:tc>
@@ -8442,7 +8647,14 @@
                 <w:rFonts w:ascii="Calibri" w:hAnsi="Calibri"/>
                 <w:sz w:val="16"/>
               </w:rPr>
-              <w:t>Balanza aislada con transcripción manual; Consola de riego aislada.</w:t>
+              <w:t>Balanza aislada con transcripción manual; Con</w:t>
+            </w:r>
+            <w:r>
+              <w:rPr>
+                <w:rFonts w:ascii="Calibri" w:hAnsi="Calibri"/>
+                <w:sz w:val="16"/>
+              </w:rPr>
+              <w:t>sola de riego aislada.</w:t>
             </w:r>
           </w:p>
         </w:tc>
@@ -8568,14 +8780,7 @@
                 <w:rFonts w:ascii="Calibri" w:hAnsi="Calibri"/>
                 <w:sz w:val="16"/>
               </w:rPr>
-              <w:t>Servidor</w:t>
-            </w:r>
-            <w:r>
-              <w:rPr>
-                <w:rFonts w:ascii="Calibri" w:hAnsi="Calibri"/>
-                <w:sz w:val="16"/>
-              </w:rPr>
-              <w:t xml:space="preserve"> único con UPS 10 min; Red plana y enlace monoproveedor.</w:t>
+              <w:t>Servidor único con UPS 10 min; Red plana y enlace monoproveedor.</w:t>
             </w:r>
           </w:p>
         </w:tc>
@@ -8661,7 +8866,6 @@
                 <w:b/>
                 <w:sz w:val="16"/>
               </w:rPr>
-              <w:lastRenderedPageBreak/>
               <w:t>PT-05</w:t>
             </w:r>
           </w:p>
@@ -8868,7 +9072,14 @@
                 <w:rFonts w:ascii="Calibri" w:hAnsi="Calibri"/>
                 <w:sz w:val="16"/>
               </w:rPr>
-              <w:t>Ninguna (Habilitador)</w:t>
+              <w:t>Ninguna (Habilitad</w:t>
+            </w:r>
+            <w:r>
+              <w:rPr>
+                <w:rFonts w:ascii="Calibri" w:hAnsi="Calibri"/>
+                <w:sz w:val="16"/>
+              </w:rPr>
+              <w:t>or)</w:t>
             </w:r>
           </w:p>
         </w:tc>
@@ -8913,7 +9124,7 @@
           <w:color w:val="334155"/>
           <w:sz w:val="20"/>
         </w:rPr>
-        <w:t xml:space="preserve">Secuencia obligada determinada: La Fase 1 (PT-01, PT-04 y PT-06) </w:t>
+        <w:t>Secuencia obligada determinada: La Fase 1 (PT-01, PT-04 y PT-06) constituye la base habilitadora obligatoria. La Fase 2 (PT-02 y PT-03) no puede iniciar sin datos maestros saneados ni redes industriales operativas</w:t>
       </w:r>
       <w:r>
         <w:rPr>
@@ -8921,7 +9132,7 @@
           <w:color w:val="334155"/>
           <w:sz w:val="20"/>
         </w:rPr>
-        <w:t>constituye la base habilitadora obligatoria. La Fase 2 (PT-02 y PT-03) no puede iniciar sin datos maestros saneados ni redes industriales operativas. Finalmente, la Fase 3 (PT-05) optimiza los costos una vez que la trazabilidad en planta está estabilizada.</w:t>
+        <w:t>. Finalmente, la Fase 3 (PT-05) optimiza los costos una vez que la trazabilidad en planta está estabilizada.</w:t>
       </w:r>
     </w:p>
     <w:p>
@@ -8929,7 +9140,7 @@
         <w:pStyle w:val="Ttulo2"/>
         <w:spacing w:after="80"/>
       </w:pPr>
-      <w:bookmarkStart w:id="15" w:name="_Toc242976727"/>
+      <w:bookmarkStart w:id="15" w:name="_Toc242977373"/>
       <w:r>
         <w:rPr>
           <w:rFonts w:ascii="Calibri" w:hAnsi="Calibri"/>
@@ -8968,7 +9179,7 @@
           <w:color w:val="334155"/>
           <w:sz w:val="20"/>
         </w:rPr>
-        <w:t>Exportar las vistas formales en alta resolución y redactar formalmente la Sección 5 (Arquitectura Empresarial) del PETI para su incorporación en la versión v0.10 del plan institucional</w:t>
+        <w:t>Exportar las vistas formales en alta resolución y redactar formalmente la Se</w:t>
       </w:r>
       <w:r>
         <w:rPr>
@@ -8976,7 +9187,7 @@
           <w:color w:val="334155"/>
           <w:sz w:val="20"/>
         </w:rPr>
-        <w:t>.</w:t>
+        <w:t>cción 5 (Arquitectura Empresarial) del PETI para su incorporación en la versión v0.10 del plan institucional.</w:t>
       </w:r>
     </w:p>
     <w:p>
@@ -9008,7 +9219,7 @@
           <w:color w:val="334155"/>
           <w:sz w:val="20"/>
         </w:rPr>
-        <w:t>Redacción completa de 'docs/05_seccion_arquitectura.md' estructurada en cuatro subsecciones: 5.1 Principios, 5.2 Arquitectura actual, 5.3 Arquitectura objetivo y 5.4 Análisis de brechas. Enlace: https://github.com/GianfrancoArocutipa/</w:t>
+        <w:t xml:space="preserve">Redacción completa de 'docs/05_seccion_arquitectura.md' estructurada en cuatro subsecciones: 5.1 Principios, 5.2 Arquitectura </w:t>
       </w:r>
       <w:r>
         <w:rPr>
@@ -9016,7 +9227,16 @@
           <w:color w:val="334155"/>
           <w:sz w:val="20"/>
         </w:rPr>
-        <w:t>Taller10_Empresa_01_Exportadora/tree/taller-10/docs/05_seccion_arquitectura.md</w:t>
+        <w:t xml:space="preserve">actual, 5.3 Arquitectura objetivo y 5.4 Análisis de brechas. Enlace: </w:t>
+      </w:r>
+      <w:r>
+        <w:rPr>
+          <w:rFonts w:ascii="Calibri" w:hAnsi="Calibri"/>
+          <w:color w:val="334155"/>
+          <w:sz w:val="20"/>
+        </w:rPr>
+        <w:lastRenderedPageBreak/>
+        <w:t>https://github.com/GianfrancoArocutipa/Taller10_Empresa_01_Exportadora/tree/taller-10/docs/05_seccion_arquitectura.md</w:t>
       </w:r>
     </w:p>
     <w:p>
@@ -9048,7 +9268,15 @@
           <w:color w:val="334155"/>
           <w:sz w:val="20"/>
         </w:rPr>
-        <w:t>Sección 5 redactada íntegramente cumpliendo la numeración estándar y consolidando el diagnóstico, los modelos y la hoja de ruta preliminar.</w:t>
+        <w:t xml:space="preserve">Sección 5 redactada íntegramente </w:t>
+      </w:r>
+      <w:r>
+        <w:rPr>
+          <w:rFonts w:ascii="Calibri" w:hAnsi="Calibri"/>
+          <w:color w:val="334155"/>
+          <w:sz w:val="20"/>
+        </w:rPr>
+        <w:t>cumpliendo la numeración estándar y consolidando el diagnóstico, los modelos y la hoja de ruta preliminar.</w:t>
       </w:r>
     </w:p>
     <w:p>
@@ -9056,20 +9284,13 @@
         <w:pStyle w:val="Ttulo2"/>
         <w:spacing w:after="80"/>
       </w:pPr>
-      <w:bookmarkStart w:id="16" w:name="_Toc242976728"/>
+      <w:bookmarkStart w:id="16" w:name="_Toc242977374"/>
       <w:r>
         <w:rPr>
           <w:rFonts w:ascii="Calibri" w:hAnsi="Calibri"/>
           <w:color w:val="1F4E79"/>
         </w:rPr>
-        <w:t>Paso F —</w:t>
-      </w:r>
-      <w:r>
-        <w:rPr>
-          <w:rFonts w:ascii="Calibri" w:hAnsi="Calibri"/>
-          <w:color w:val="1F4E79"/>
-        </w:rPr>
-        <w:t xml:space="preserve"> Validar y corregir</w:t>
+        <w:t>Paso F — Validar y corregir</w:t>
       </w:r>
       <w:bookmarkEnd w:id="16"/>
     </w:p>
@@ -9102,7 +9323,15 @@
           <w:color w:val="334155"/>
           <w:sz w:val="20"/>
         </w:rPr>
-        <w:t>Someter los artefactos producidos a las tres comprobaciones obligatorias de calidad antes de cerrar la sesión de laboratorio, registrando el resultado en 'docs/evidencias/S10/salidas/validaciones.txt'.</w:t>
+        <w:t xml:space="preserve">Someter los artefactos producidos a las tres comprobaciones obligatorias de calidad antes de cerrar la </w:t>
+      </w:r>
+      <w:r>
+        <w:rPr>
+          <w:rFonts w:ascii="Calibri" w:hAnsi="Calibri"/>
+          <w:color w:val="334155"/>
+          <w:sz w:val="20"/>
+        </w:rPr>
+        <w:t>sesión de laboratorio, registrando el resultado en 'docs/evidencias/S10/salidas/validaciones.txt'.</w:t>
       </w:r>
     </w:p>
     <w:p>
@@ -9126,7 +9355,30 @@
           <w:color w:val="0F172A"/>
           <w:sz w:val="20"/>
         </w:rPr>
-        <w:t>Comando o acci</w:t>
+        <w:t xml:space="preserve">Comando o acción: </w:t>
+      </w:r>
+      <w:r>
+        <w:rPr>
+          <w:rFonts w:ascii="Calibri" w:hAnsi="Calibri"/>
+          <w:color w:val="334155"/>
+          <w:sz w:val="20"/>
+        </w:rPr>
+        <w:t>Auditoría cruzada del modelo ArchiMate frente al inventario real y verificación de relaciones bidireccionales en las brechas.</w:t>
+      </w:r>
+    </w:p>
+    <w:p>
+      <w:pPr>
+        <w:pStyle w:val="Compact"/>
+        <w:spacing w:after="60" w:line="276" w:lineRule="auto"/>
+      </w:pPr>
+      <w:r>
+        <w:rPr>
+          <w:rFonts w:ascii="Calibri" w:hAnsi="Calibri"/>
+          <w:b/>
+          <w:color w:val="1F4E79"/>
+          <w:sz w:val="20"/>
+        </w:rPr>
+        <w:t xml:space="preserve">• </w:t>
       </w:r>
       <w:r>
         <w:rPr>
@@ -9135,7 +9387,16 @@
           <w:color w:val="0F172A"/>
           <w:sz w:val="20"/>
         </w:rPr>
-        <w:t xml:space="preserve">ón: </w:t>
+        <w:t>Evidencia</w:t>
+      </w:r>
+      <w:r>
+        <w:rPr>
+          <w:rFonts w:ascii="Calibri" w:hAnsi="Calibri"/>
+          <w:b/>
+          <w:color w:val="0F172A"/>
+          <w:sz w:val="20"/>
+        </w:rPr>
+        <w:t xml:space="preserve"> de que funcionó: </w:t>
       </w:r>
       <w:r>
         <w:rPr>
@@ -9143,7 +9404,7 @@
           <w:color w:val="334155"/>
           <w:sz w:val="20"/>
         </w:rPr>
-        <w:t>Auditoría cruzada del modelo ArchiMate frente al inventario real y verificación de relaciones bidireccionales en las brechas.</w:t>
+        <w:t>Las tres comprobaciones resultaron plenamente satisfactorias:</w:t>
       </w:r>
     </w:p>
     <w:p>
@@ -9167,7 +9428,7 @@
           <w:color w:val="0F172A"/>
           <w:sz w:val="20"/>
         </w:rPr>
-        <w:t xml:space="preserve">Evidencia de que funcionó: </w:t>
+        <w:t xml:space="preserve">1. </w:t>
       </w:r>
       <w:r>
         <w:rPr>
@@ -9175,7 +9436,15 @@
           <w:color w:val="334155"/>
           <w:sz w:val="20"/>
         </w:rPr>
-        <w:t>Las tres comprobaciones resultaron plenamente satisfactorias:</w:t>
+        <w:t>Comprobación 1 (Pertenencia de Capas en ArchiMate 3.2): Cumplida. Se verificó que los procesos y actores residan en Negocio, los sistemas y hojas de cálculo en Aplicación,</w:t>
+      </w:r>
+      <w:r>
+        <w:rPr>
+          <w:rFonts w:ascii="Calibri" w:hAnsi="Calibri"/>
+          <w:color w:val="334155"/>
+          <w:sz w:val="20"/>
+        </w:rPr>
+        <w:t xml:space="preserve"> y los nodos, redes y DBMS en Tecnología.</w:t>
       </w:r>
     </w:p>
     <w:p>
@@ -9199,7 +9468,7 @@
           <w:color w:val="0F172A"/>
           <w:sz w:val="20"/>
         </w:rPr>
-        <w:t xml:space="preserve">1. </w:t>
+        <w:t xml:space="preserve">2. </w:t>
       </w:r>
       <w:r>
         <w:rPr>
@@ -9207,15 +9476,7 @@
           <w:color w:val="334155"/>
           <w:sz w:val="20"/>
         </w:rPr>
-        <w:t>Comprobación 1 (Pertenencia de</w:t>
-      </w:r>
-      <w:r>
-        <w:rPr>
-          <w:rFonts w:ascii="Calibri" w:hAnsi="Calibri"/>
-          <w:color w:val="334155"/>
-          <w:sz w:val="20"/>
-        </w:rPr>
-        <w:t xml:space="preserve"> Capas en ArchiMate 3.2): Cumplida. Se verificó que los procesos y actores residan en Negocio, los sistemas y hojas de cálculo en Aplicación, y los nodos, redes y DBMS en Tecnología.</w:t>
+        <w:t>Comprobación 2 (Existencia Real de Aplicaciones): Cumplida. Se contrastó el modelo con el inventario oficial. No se incluyeron aplicaciones teóricas; las 8 aplicaciones modeladas existen y operan en La Yarada.</w:t>
       </w:r>
     </w:p>
     <w:p>
@@ -9239,7 +9500,7 @@
           <w:color w:val="0F172A"/>
           <w:sz w:val="20"/>
         </w:rPr>
-        <w:t xml:space="preserve">2. </w:t>
+        <w:t xml:space="preserve">3. </w:t>
       </w:r>
       <w:r>
         <w:rPr>
@@ -9247,16 +9508,23 @@
           <w:color w:val="334155"/>
           <w:sz w:val="20"/>
         </w:rPr>
-        <w:t>Comprobación 2 (Existencia Real de Aplicaciones): Cumplida. Se contr</w:t>
-      </w:r>
-      <w:r>
-        <w:rPr>
-          <w:rFonts w:ascii="Calibri" w:hAnsi="Calibri"/>
-          <w:color w:val="334155"/>
-          <w:sz w:val="20"/>
-        </w:rPr>
-        <w:t>astó el modelo con el inventario oficial. No se incluyeron aplicaciones teóricas; las 8 aplicaciones modeladas existen y operan en La Yarada.</w:t>
-      </w:r>
+        <w:t>Comprobación 3 (Trazabilidad Bipolar de Brechas): Cumplida. Las 13 brechas tienen origen claro en el modelo As-Is y solución concreta en el modelo To-Be, sin elementos huérfanos.</w:t>
+      </w:r>
+    </w:p>
+    <w:p>
+      <w:pPr>
+        <w:pStyle w:val="Ttulo2"/>
+        <w:spacing w:after="80"/>
+      </w:pPr>
+      <w:bookmarkStart w:id="17" w:name="_Toc242977375"/>
+      <w:r>
+        <w:rPr>
+          <w:rFonts w:ascii="Calibri" w:hAnsi="Calibri"/>
+          <w:color w:val="1F4E79"/>
+        </w:rPr>
+        <w:t>Paso G — Registrar la evidencia y cerrar</w:t>
+      </w:r>
+      <w:bookmarkEnd w:id="17"/>
     </w:p>
     <w:p>
       <w:pPr>
@@ -9279,7 +9547,7 @@
           <w:color w:val="0F172A"/>
           <w:sz w:val="20"/>
         </w:rPr>
-        <w:t xml:space="preserve">3. </w:t>
+        <w:t xml:space="preserve">Qué se buscaba: </w:t>
       </w:r>
       <w:r>
         <w:rPr>
@@ -9287,7 +9555,7 @@
           <w:color w:val="334155"/>
           <w:sz w:val="20"/>
         </w:rPr>
-        <w:t>Comprobación 3 (Trazabilidad Bipolar de Brechas): Cumplida. Las 13 brechas tienen origen claro en el modelo A</w:t>
+        <w:t>Versionar en</w:t>
       </w:r>
       <w:r>
         <w:rPr>
@@ -9295,23 +9563,8 @@
           <w:color w:val="334155"/>
           <w:sz w:val="20"/>
         </w:rPr>
-        <w:t>s-Is y solución concreta en el modelo To-Be, sin elementos huérfanos.</w:t>
-      </w:r>
-    </w:p>
-    <w:p>
-      <w:pPr>
-        <w:pStyle w:val="Ttulo2"/>
-        <w:spacing w:after="80"/>
-      </w:pPr>
-      <w:bookmarkStart w:id="17" w:name="_Toc242976729"/>
-      <w:r>
-        <w:rPr>
-          <w:rFonts w:ascii="Calibri" w:hAnsi="Calibri"/>
-          <w:color w:val="1F4E79"/>
-        </w:rPr>
-        <w:t>Paso G — Registrar la evidencia y cerrar</w:t>
-      </w:r>
-      <w:bookmarkEnd w:id="17"/>
+        <w:t xml:space="preserve"> Git todos los artefactos creados, generar las etiquetas requeridas y responder la pregunta de transferencia metodológica.</w:t>
+      </w:r>
     </w:p>
     <w:p>
       <w:pPr>
@@ -9334,7 +9587,7 @@
           <w:color w:val="0F172A"/>
           <w:sz w:val="20"/>
         </w:rPr>
-        <w:t xml:space="preserve">Qué se buscaba: </w:t>
+        <w:t xml:space="preserve">Comando o acción: </w:t>
       </w:r>
       <w:r>
         <w:rPr>
@@ -9342,15 +9595,35 @@
           <w:color w:val="334155"/>
           <w:sz w:val="20"/>
         </w:rPr>
-        <w:t>Versionar en Git todos los artefactos creados, generar las etiquetas requeridas y responder la pregunta de transferencia metodo</w:t>
-      </w:r>
-      <w:r>
-        <w:rPr>
-          <w:rFonts w:ascii="Calibri" w:hAnsi="Calibri"/>
-          <w:color w:val="334155"/>
-          <w:sz w:val="20"/>
-        </w:rPr>
-        <w:t>lógica.</w:t>
+        <w:t>Ejecución de los comandos oficiales de control de versiones y etiquetado:</w:t>
+      </w:r>
+    </w:p>
+    <w:p>
+      <w:pPr>
+        <w:pStyle w:val="SourceCode"/>
+        <w:ind w:left="432"/>
+      </w:pPr>
+      <w:r>
+        <w:t>git add .</w:t>
+      </w:r>
+      <w:r>
+        <w:br/>
+        <w:t>git commit -m "S10: arquitect</w:t>
+      </w:r>
+      <w:r>
+        <w:t>ura empresarial actual, objetivo y analisis de brechas — seccion 5"</w:t>
+      </w:r>
+      <w:r>
+        <w:br/>
+        <w:t>git tag -a v0.10 -m "PETI v0.10 — arquitectura empresarial"</w:t>
+      </w:r>
+      <w:r>
+        <w:br/>
+        <w:t>git tag -a taller-10 -m "Taller 10 · SI886"</w:t>
+      </w:r>
+      <w:r>
+        <w:br/>
+        <w:t>git push origin main --tags</w:t>
       </w:r>
     </w:p>
     <w:p>
@@ -9374,7 +9647,7 @@
           <w:color w:val="0F172A"/>
           <w:sz w:val="20"/>
         </w:rPr>
-        <w:t xml:space="preserve">Comando o acción: </w:t>
+        <w:t xml:space="preserve">Evidencia de que funcionó: </w:t>
       </w:r>
       <w:r>
         <w:rPr>
@@ -9382,59 +9655,7 @@
           <w:color w:val="334155"/>
           <w:sz w:val="20"/>
         </w:rPr>
-        <w:t>Ejecución de los comandos oficiales de control de versiones y etiquetado:</w:t>
-      </w:r>
-    </w:p>
-    <w:p>
-      <w:pPr>
-        <w:pStyle w:val="SourceCode"/>
-        <w:ind w:left="432"/>
-      </w:pPr>
-      <w:r>
-        <w:t>git add .</w:t>
-      </w:r>
-      <w:r>
-        <w:br/>
-        <w:t>git commit -m "S10: arquitectura empresarial actual, objetivo y analisis de brechas — seccion 5"</w:t>
-      </w:r>
-      <w:r>
-        <w:br/>
-        <w:t xml:space="preserve">git tag -a v0.10 -m "PETI v0.10 — arquitectura </w:t>
-      </w:r>
-      <w:r>
-        <w:t>empresarial"</w:t>
-      </w:r>
-      <w:r>
-        <w:br/>
-        <w:t>git tag -a taller-10 -m "Taller 10 · SI886"</w:t>
-      </w:r>
-      <w:r>
-        <w:br/>
-        <w:t>git push origin main --tags</w:t>
-      </w:r>
-    </w:p>
-    <w:p>
-      <w:pPr>
-        <w:pStyle w:val="Compact"/>
-        <w:spacing w:after="60" w:line="276" w:lineRule="auto"/>
-      </w:pPr>
-      <w:r>
-        <w:rPr>
-          <w:rFonts w:ascii="Calibri" w:hAnsi="Calibri"/>
-          <w:b/>
-          <w:color w:val="1F4E79"/>
-          <w:sz w:val="20"/>
-        </w:rPr>
-        <w:t xml:space="preserve">• </w:t>
-      </w:r>
-      <w:r>
-        <w:rPr>
-          <w:rFonts w:ascii="Calibri" w:hAnsi="Calibri"/>
-          <w:b/>
-          <w:color w:val="0F172A"/>
-          <w:sz w:val="20"/>
-        </w:rPr>
-        <w:t xml:space="preserve">Evidencia de que funcionó: </w:t>
+        <w:t>Versionamiento exitoso bajo</w:t>
       </w:r>
       <w:r>
         <w:rPr>
@@ -9442,15 +9663,7 @@
           <w:color w:val="334155"/>
           <w:sz w:val="20"/>
         </w:rPr>
-        <w:t>Versionamiento exitoso bajo los tags 'v0.10' y 'taller-10'. Asimismo, se respondió exhaustivamente a la pregunta de transferencia en la Secció</w:t>
-      </w:r>
-      <w:r>
-        <w:rPr>
-          <w:rFonts w:ascii="Calibri" w:hAnsi="Calibri"/>
-          <w:color w:val="334155"/>
-          <w:sz w:val="20"/>
-        </w:rPr>
-        <w:t>n 5 del cuestionario.</w:t>
+        <w:t xml:space="preserve"> los tags 'v0.10' y 'taller-10'. Asimismo, se respondió exhaustivamente a la pregunta de transferencia en la Sección 5 del cuestionario.</w:t>
       </w:r>
     </w:p>
     <w:p>
@@ -9458,12 +9671,11 @@
         <w:pStyle w:val="Ttulo1"/>
         <w:spacing w:after="120"/>
       </w:pPr>
-      <w:bookmarkStart w:id="18" w:name="_Toc242976730"/>
-      <w:r>
-        <w:rPr>
-          <w:rFonts w:ascii="Calibri" w:hAnsi="Calibri"/>
-        </w:rPr>
-        <w:lastRenderedPageBreak/>
+      <w:bookmarkStart w:id="18" w:name="_Toc242977376"/>
+      <w:r>
+        <w:rPr>
+          <w:rFonts w:ascii="Calibri" w:hAnsi="Calibri"/>
+        </w:rPr>
         <w:t>3. Resultados</w:t>
       </w:r>
       <w:bookmarkEnd w:id="18"/>
@@ -9478,7 +9690,15 @@
           <w:color w:val="334155"/>
           <w:sz w:val="20"/>
         </w:rPr>
-        <w:t>A continuación se presenta la matriz de comprobación oficial del Taller 10, evaluada frente a los resultados esperados de la guía y respaldada por las evidencias verificables en el repositorio:</w:t>
+        <w:t>A continuación se presenta la matriz de comprobación oficial del Taller 10, evaluada frente a los resulta</w:t>
+      </w:r>
+      <w:r>
+        <w:rPr>
+          <w:rFonts w:ascii="Calibri" w:hAnsi="Calibri"/>
+          <w:color w:val="334155"/>
+          <w:sz w:val="20"/>
+        </w:rPr>
+        <w:t>dos esperados de la guía y respaldada por las evidencias verificables en el repositorio:</w:t>
       </w:r>
     </w:p>
     <w:tbl>
@@ -9572,16 +9792,7 @@
                 <w:color w:val="FFFFFF"/>
                 <w:sz w:val="18"/>
               </w:rPr>
-              <w:t xml:space="preserve">¿Se </w:t>
-            </w:r>
-            <w:r>
-              <w:rPr>
-                <w:rFonts w:ascii="Calibri" w:hAnsi="Calibri"/>
-                <w:b/>
-                <w:color w:val="FFFFFF"/>
-                <w:sz w:val="18"/>
-              </w:rPr>
-              <w:t>logró?</w:t>
+              <w:t>¿Se logró?</w:t>
             </w:r>
           </w:p>
         </w:tc>
@@ -9741,14 +9952,7 @@
                 <w:rFonts w:ascii="Calibri" w:hAnsi="Calibri"/>
                 <w:sz w:val="16"/>
               </w:rPr>
-              <w:t>Modelo</w:t>
-            </w:r>
-            <w:r>
-              <w:rPr>
-                <w:rFonts w:ascii="Calibri" w:hAnsi="Calibri"/>
-                <w:sz w:val="16"/>
-              </w:rPr>
-              <w:t xml:space="preserve"> en Archi con las tres capas de la arquitectura actual</w:t>
+              <w:t>Modelo en Archi con las tres capas de la arquitectura actual</w:t>
             </w:r>
           </w:p>
         </w:tc>
@@ -9790,7 +9994,14 @@
                 <w:rFonts w:ascii="Calibri" w:hAnsi="Calibri"/>
                 <w:sz w:val="16"/>
               </w:rPr>
-              <w:t>https://github.com/GianfrancoArocutipa/Taller10_Empresa_01_Exportadora/tree/taller-10/anexos/anexo_A_modelo_arquitectura.archimate</w:t>
+              <w:t>https://github.com/GianfrancoArocutipa/Taller10_Empresa_01_Expo</w:t>
+            </w:r>
+            <w:r>
+              <w:rPr>
+                <w:rFonts w:ascii="Calibri" w:hAnsi="Calibri"/>
+                <w:sz w:val="16"/>
+              </w:rPr>
+              <w:t>rtadora/tree/taller-10/anexos/anexo_A_modelo_arquitectura.archimate</w:t>
             </w:r>
           </w:p>
         </w:tc>
@@ -9836,14 +10047,7 @@
                 <w:rFonts w:ascii="Calibri" w:hAnsi="Calibri"/>
                 <w:sz w:val="16"/>
               </w:rPr>
-              <w:t>Las hojas de cálculo modeladas como componentes de aplicaci</w:t>
-            </w:r>
-            <w:r>
-              <w:rPr>
-                <w:rFonts w:ascii="Calibri" w:hAnsi="Calibri"/>
-                <w:sz w:val="16"/>
-              </w:rPr>
-              <w:t>ón</w:t>
+              <w:t>Las hojas de cálculo modeladas como componentes de aplicación</w:t>
             </w:r>
           </w:p>
         </w:tc>
@@ -9885,7 +10089,15 @@
                 <w:rFonts w:ascii="Calibri" w:hAnsi="Calibri"/>
                 <w:sz w:val="16"/>
               </w:rPr>
-              <w:t>https://github.com/GianfrancoArocutipa/Taller10_Empresa_01_Exportadora/tree/taller-10/docs/evidencias/S10/graficos/vista_actual_3capas.png</w:t>
+              <w:t>https://github.com/GianfrancoArocutipa/Taller10_Empresa_01_Exportadora/tree/taller-10/docs/evidencias/S10/graficos/vista_actual_3capas.</w:t>
+            </w:r>
+            <w:r>
+              <w:rPr>
+                <w:rFonts w:ascii="Calibri" w:hAnsi="Calibri"/>
+                <w:sz w:val="16"/>
+              </w:rPr>
+              <w:lastRenderedPageBreak/>
+              <w:t>png</w:t>
             </w:r>
           </w:p>
         </w:tc>
@@ -9911,6 +10123,7 @@
                 <w:b/>
                 <w:sz w:val="16"/>
               </w:rPr>
+              <w:lastRenderedPageBreak/>
               <w:t>4</w:t>
             </w:r>
           </w:p>
@@ -9973,7 +10186,14 @@
                 <w:rFonts w:ascii="Calibri" w:hAnsi="Calibri"/>
                 <w:sz w:val="16"/>
               </w:rPr>
-              <w:t>https://github.com/GianfrancoArocutipa/Taller10_Empresa_01_Exportadora/tree/taller-10/docs/evidencias/S10/graficos/vista_cooperacion.png</w:t>
+              <w:t>https://github.com/Gia</w:t>
+            </w:r>
+            <w:r>
+              <w:rPr>
+                <w:rFonts w:ascii="Calibri" w:hAnsi="Calibri"/>
+                <w:sz w:val="16"/>
+              </w:rPr>
+              <w:t>nfrancoArocutipa/Taller10_Empresa_01_Exportadora/tree/taller-10/docs/evidencias/S10/graficos/vista_cooperacion.png</w:t>
             </w:r>
           </w:p>
         </w:tc>
@@ -10061,14 +10281,14 @@
                 <w:rFonts w:ascii="Calibri" w:hAnsi="Calibri"/>
                 <w:sz w:val="16"/>
               </w:rPr>
-              <w:t>https://github.com/Gia</w:t>
-            </w:r>
-            <w:r>
-              <w:rPr>
-                <w:rFonts w:ascii="Calibri" w:hAnsi="Calibri"/>
-                <w:sz w:val="16"/>
-              </w:rPr>
-              <w:t>nfrancoArocutipa/Taller10_Empresa_01_Exportadora/tree/taller-10/05_arquitectura/AR02_entidades.csv</w:t>
+              <w:t>https://github.com/GianfrancoArocutipa/Talle</w:t>
+            </w:r>
+            <w:r>
+              <w:rPr>
+                <w:rFonts w:ascii="Calibri" w:hAnsi="Calibri"/>
+                <w:sz w:val="16"/>
+              </w:rPr>
+              <w:t>r10_Empresa_01_Exportadora/tree/taller-10/05_arquitectura/AR02_entidades.csv</w:t>
             </w:r>
           </w:p>
         </w:tc>
@@ -10156,14 +10376,14 @@
                 <w:rFonts w:ascii="Calibri" w:hAnsi="Calibri"/>
                 <w:sz w:val="16"/>
               </w:rPr>
-              <w:t>5 de 7 entidades (71.4%) en https://github.com/GianfrancoArocutipa/Taller10</w:t>
-            </w:r>
-            <w:r>
-              <w:rPr>
-                <w:rFonts w:ascii="Calibri" w:hAnsi="Calibri"/>
-                <w:sz w:val="16"/>
-              </w:rPr>
-              <w:t>_Empresa_01_Exportadora/tree/taller-10/05_arquitectura/AR02_entidades.csv</w:t>
+              <w:t>5 de 7 entidades (71.4%) en https://github.com/GianfrancoArocutipa/Taller10_Empresa_01_Exportador</w:t>
+            </w:r>
+            <w:r>
+              <w:rPr>
+                <w:rFonts w:ascii="Calibri" w:hAnsi="Calibri"/>
+                <w:sz w:val="16"/>
+              </w:rPr>
+              <w:t>a/tree/taller-10/05_arquitectura/AR02_entidades.csv</w:t>
             </w:r>
           </w:p>
         </w:tc>
@@ -10251,14 +10471,14 @@
                 <w:rFonts w:ascii="Calibri" w:hAnsi="Calibri"/>
                 <w:sz w:val="16"/>
               </w:rPr>
-              <w:t>3 entidades clasificadas en https://github.com/GianfrancoArocutipa/Taller10_Empresa_01_Exportadora/</w:t>
-            </w:r>
-            <w:r>
-              <w:rPr>
-                <w:rFonts w:ascii="Calibri" w:hAnsi="Calibri"/>
-                <w:sz w:val="16"/>
-              </w:rPr>
-              <w:t>tree/taller-10/05_arquitectura/AR02_entidades.csv</w:t>
+              <w:t>3 entidades clasificadas en https://github.com/GianfrancoArocutipa/Taller10_Empresa_01_Exportadora/tree/taller-10/05_arqu</w:t>
+            </w:r>
+            <w:r>
+              <w:rPr>
+                <w:rFonts w:ascii="Calibri" w:hAnsi="Calibri"/>
+                <w:sz w:val="16"/>
+              </w:rPr>
+              <w:t>itectura/AR02_entidades.csv</w:t>
             </w:r>
           </w:p>
         </w:tc>
@@ -10392,7 +10612,14 @@
                 <w:rFonts w:ascii="Calibri" w:hAnsi="Calibri"/>
                 <w:sz w:val="16"/>
               </w:rPr>
-              <w:t>Análisis de brechas con ≥ 10 brechas, su tipo, esfuerzo y dependencias</w:t>
+              <w:t xml:space="preserve">Análisis de </w:t>
+            </w:r>
+            <w:r>
+              <w:rPr>
+                <w:rFonts w:ascii="Calibri" w:hAnsi="Calibri"/>
+                <w:sz w:val="16"/>
+              </w:rPr>
+              <w:t>brechas con ≥ 10 brechas, su tipo, esfuerzo y dependencias</w:t>
             </w:r>
           </w:p>
         </w:tc>
@@ -10434,14 +10661,7 @@
                 <w:rFonts w:ascii="Calibri" w:hAnsi="Calibri"/>
                 <w:sz w:val="16"/>
               </w:rPr>
-              <w:t>13 brechas en https://github.com/Gianfra</w:t>
-            </w:r>
-            <w:r>
-              <w:rPr>
-                <w:rFonts w:ascii="Calibri" w:hAnsi="Calibri"/>
-                <w:sz w:val="16"/>
-              </w:rPr>
-              <w:t>ncoArocutipa/Taller10_Empresa_01_Exportadora/tree/taller-10/05_arquitectura/AR03_brechas.csv</w:t>
+              <w:t>13 brechas en https://github.com/GianfrancoArocutipa/Taller10_Empresa_01_Exportadora/tree/taller-10/05_arquitectura/AR03_brechas.csv</w:t>
             </w:r>
           </w:p>
         </w:tc>
@@ -10529,14 +10749,7 @@
                 <w:rFonts w:ascii="Calibri" w:hAnsi="Calibri"/>
                 <w:sz w:val="16"/>
               </w:rPr>
-              <w:t xml:space="preserve">6 paquetes (PT-01 a PT-06) en </w:t>
-            </w:r>
-            <w:r>
-              <w:rPr>
-                <w:rFonts w:ascii="Calibri" w:hAnsi="Calibri"/>
-                <w:sz w:val="16"/>
-              </w:rPr>
-              <w:t>https://github.com/GianfrancoArocutipa/Taller10_Empresa_01_Exportadora/tree/taller-10/docs/evidencias/S10/salidas/salida_brechas.txt</w:t>
+              <w:t>6 paquetes (PT-01 a PT-06) en https://github.com/GianfrancoArocutipa/Taller10_Empresa_01_Exportadora/tree/taller-10/docs/evidencias/S10/salidas/salida_brechas.txt</w:t>
             </w:r>
           </w:p>
         </w:tc>
@@ -10624,14 +10837,14 @@
                 <w:rFonts w:ascii="Calibri" w:hAnsi="Calibri"/>
                 <w:sz w:val="16"/>
               </w:rPr>
-              <w:t>Secuencia en 3 fases en https://github.com/GianfrancoArocutipa/</w:t>
-            </w:r>
-            <w:r>
-              <w:rPr>
-                <w:rFonts w:ascii="Calibri" w:hAnsi="Calibri"/>
-                <w:sz w:val="16"/>
-              </w:rPr>
-              <w:t>Taller10_Empresa_01_Exportadora/tree/taller-10/docs/evidencias/S10/salidas/salida_brechas.txt</w:t>
+              <w:t>Secuencia en 3 fases en https://</w:t>
+            </w:r>
+            <w:r>
+              <w:rPr>
+                <w:rFonts w:ascii="Calibri" w:hAnsi="Calibri"/>
+                <w:sz w:val="16"/>
+              </w:rPr>
+              <w:t>github.com/GianfrancoArocutipa/Taller10_Empresa_01_Exportadora/tree/taller-10/docs/evidencias/S10/salidas/salida_brechas.txt</w:t>
             </w:r>
           </w:p>
         </w:tc>
@@ -10719,15 +10932,7 @@
                 <w:rFonts w:ascii="Calibri" w:hAnsi="Calibri"/>
                 <w:sz w:val="16"/>
               </w:rPr>
-              <w:t>https://github.com/GianfrancoArocutipa/Taller10_Empresa_01_Exportadora/tree/taller-</w:t>
-            </w:r>
-            <w:r>
-              <w:rPr>
-                <w:rFonts w:ascii="Calibri" w:hAnsi="Calibri"/>
-                <w:sz w:val="16"/>
-              </w:rPr>
-              <w:lastRenderedPageBreak/>
-              <w:t>10/docs/evidencias/S10/graficos/</w:t>
+              <w:t>https://github.com/GianfrancoArocutipa/Taller10_Empresa_01_Exportadora/tree/taller-10/docs/evidencias/S10/graficos/</w:t>
             </w:r>
           </w:p>
         </w:tc>
@@ -10753,7 +10958,6 @@
                 <w:b/>
                 <w:sz w:val="16"/>
               </w:rPr>
-              <w:lastRenderedPageBreak/>
               <w:t>13</w:t>
             </w:r>
           </w:p>
@@ -10864,7 +11068,7 @@
         <w:pStyle w:val="Ttulo1"/>
         <w:spacing w:after="120"/>
       </w:pPr>
-      <w:bookmarkStart w:id="19" w:name="_Toc242976731"/>
+      <w:bookmarkStart w:id="19" w:name="_Toc242977377"/>
       <w:r>
         <w:rPr>
           <w:rFonts w:ascii="Calibri" w:hAnsi="Calibri"/>
@@ -10909,7 +11113,16 @@
           <w:color w:val="334155"/>
           <w:sz w:val="20"/>
         </w:rPr>
-        <w:t>lemas de trazabilidad no eran atribuibles al software de balanza, sino a la inexistencia de una fuente autoritativa de verdad. Preguntar quién responde por el lote reveló que múltiples áreas lo alimentan y ninguna responde por su consistencia.</w:t>
+        <w:t xml:space="preserve">lemas de trazabilidad no eran atribuibles al software de balanza, sino a la inexistencia de una fuente </w:t>
+      </w:r>
+      <w:r>
+        <w:rPr>
+          <w:rFonts w:ascii="Calibri" w:hAnsi="Calibri"/>
+          <w:color w:val="334155"/>
+          <w:sz w:val="20"/>
+        </w:rPr>
+        <w:lastRenderedPageBreak/>
+        <w:t>autoritativa de verdad. Preguntar quién responde por el lote reveló que múltiples áreas lo alimentan y ninguna responde por su consistencia.</w:t>
       </w:r>
     </w:p>
     <w:p>
@@ -11003,7 +11216,7 @@
         <w:pStyle w:val="Ttulo1"/>
         <w:spacing w:after="120"/>
       </w:pPr>
-      <w:bookmarkStart w:id="20" w:name="_Toc242976732"/>
+      <w:bookmarkStart w:id="20" w:name="_Toc242977378"/>
       <w:r>
         <w:rPr>
           <w:rFonts w:ascii="Calibri" w:hAnsi="Calibri"/>
@@ -11126,7 +11339,6 @@
           <w:color w:val="1F4E79"/>
           <w:sz w:val="20"/>
         </w:rPr>
-        <w:lastRenderedPageBreak/>
         <w:t xml:space="preserve">Pregunta 3: ¿Por qué se afirma en el marco TOGAF que la capa de datos es la que mayor valor aporta al PETI y la que menos suele estar </w:t>
       </w:r>
       <w:r>
@@ -11149,7 +11361,7 @@
           <w:color w:val="334155"/>
           <w:sz w:val="19"/>
         </w:rPr>
-        <w:t xml:space="preserve">Respuesta: Porque los datos representan los activos informacionales perdurables del negocio, independientes de la tecnología de turno. La tecnología cambia de servidor a nube y las aplicaciones se reemplazan, pero el histórico de lotes, </w:t>
+        <w:t>Respuesta: Porque los datos representan los activos informacionales perdurables del negocio, independientes de la tecnología de turno. La tecnología cambia de servidor a nube y las aplicaciones se reemplazan, pero el histórico de lotes, client</w:t>
       </w:r>
       <w:r>
         <w:rPr>
@@ -11157,7 +11369,7 @@
           <w:color w:val="334155"/>
           <w:sz w:val="19"/>
         </w:rPr>
-        <w:t>clientes y compras permanece. Documentar la capa de datos revela las inconsistencias estructurales que ninguna herramienta automática detecta: duplicidades de registros, ausencia de fuentes autoritativas y vacío de responsabilidades legales.</w:t>
+        <w:t>es y compras permanece. Documentar la capa de datos revela las inconsistencias estructurales que ninguna herramienta automática detecta: duplicidades de registros, ausencia de fuentes autoritativas y vacío de responsabilidades legales.</w:t>
       </w:r>
     </w:p>
     <w:p>
@@ -11171,7 +11383,7 @@
           <w:color w:val="1F4E79"/>
           <w:sz w:val="20"/>
         </w:rPr>
-        <w:t>Pregunta 4: ¿C</w:t>
+        <w:t>Pregunta 4: ¿Cómo ju</w:t>
       </w:r>
       <w:r>
         <w:rPr>
@@ -11180,7 +11392,7 @@
           <w:color w:val="1F4E79"/>
           <w:sz w:val="20"/>
         </w:rPr>
-        <w:t>ómo justifica la regla de dependencias que el paquete de trabajo PT-01 (Gobierno del Dato) deba preceder a PT-02 (Trazabilidad MES) y PT-05 (Costeo Estándar)?</w:t>
+        <w:t>stifica la regla de dependencias que el paquete de trabajo PT-01 (Gobierno del Dato) deba preceder a PT-02 (Trazabilidad MES) y PT-05 (Costeo Estándar)?</w:t>
       </w:r>
     </w:p>
     <w:p>
@@ -11193,7 +11405,7 @@
           <w:color w:val="334155"/>
           <w:sz w:val="19"/>
         </w:rPr>
-        <w:t>Respuesta: Porque un sistema transaccional o de costeo solo es tan confiable como los datos maest</w:t>
+        <w:t>Respuesta: Porque un sistema transaccional o de costeo solo es tan confiable como los datos maestros qu</w:t>
       </w:r>
       <w:r>
         <w:rPr>
@@ -11201,7 +11413,7 @@
           <w:color w:val="334155"/>
           <w:sz w:val="19"/>
         </w:rPr>
-        <w:t>ros que consume. Si se implementa un software de trazabilidad industrial o de costeo automático antes de definir la estructura única del lote y sanear el padrón de productores agrícolas, el nuevo sistema procesará registros inconsistentes, arrojando mermas</w:t>
+        <w:t>e consume. Si se implementa un software de trazabilidad industrial o de costeo automático antes de definir la estructura única del lote y sanear el padrón de productores agrícolas, el nuevo sistema procesará registros inconsistentes, arrojando mermas ficti</w:t>
       </w:r>
       <w:r>
         <w:rPr>
@@ -11209,7 +11421,7 @@
           <w:color w:val="334155"/>
           <w:sz w:val="19"/>
         </w:rPr>
-        <w:t xml:space="preserve"> ficticias y liquidaciones erróneas. El principio 'basura entra, basura sale' impone que el gobierno del dato sea siempre el primer hito habilitador.</w:t>
+        <w:t>cias y liquidaciones erróneas. El principio 'basura entra, basura sale' impone que el gobierno del dato sea siempre el primer hito habilitador.</w:t>
       </w:r>
     </w:p>
     <w:p>
@@ -11217,11 +11429,12 @@
         <w:pStyle w:val="Ttulo1"/>
         <w:spacing w:after="120"/>
       </w:pPr>
-      <w:bookmarkStart w:id="21" w:name="_Toc242976733"/>
-      <w:r>
-        <w:rPr>
-          <w:rFonts w:ascii="Calibri" w:hAnsi="Calibri"/>
-        </w:rPr>
+      <w:bookmarkStart w:id="21" w:name="_Toc242977379"/>
+      <w:r>
+        <w:rPr>
+          <w:rFonts w:ascii="Calibri" w:hAnsi="Calibri"/>
+        </w:rPr>
+        <w:lastRenderedPageBreak/>
         <w:t>6. Referencias bibliográficas</w:t>
       </w:r>
       <w:bookmarkEnd w:id="21"/>
@@ -11238,7 +11451,7 @@
           <w:color w:val="334155"/>
           <w:sz w:val="18"/>
         </w:rPr>
-        <w:t>Archi. (2024). Archi — Open Source ArchiMate Modelling (Versión 5.4). https:</w:t>
+        <w:t>Archi. (2024). Archi — Open Source ArchiMate Modelling (Versión 5.4). https://www.</w:t>
       </w:r>
       <w:r>
         <w:rPr>
@@ -11246,7 +11459,7 @@
           <w:color w:val="334155"/>
           <w:sz w:val="18"/>
         </w:rPr>
-        <w:t>//www.archimatetool.com/</w:t>
+        <w:t>archimatetool.com/</w:t>
       </w:r>
     </w:p>
     <w:p>
@@ -11276,7 +11489,7 @@
           <w:color w:val="334155"/>
           <w:sz w:val="18"/>
         </w:rPr>
-        <w:t>ISACA. (2018). COBIT 2019 Framework: Governance and Management Objectives (Objetivos</w:t>
+        <w:t>ISACA. (2018). COBIT 2019 Framework: Governance and Management Objectives (Objetivos APO03</w:t>
       </w:r>
       <w:r>
         <w:rPr>
@@ -11284,7 +11497,7 @@
           <w:color w:val="334155"/>
           <w:sz w:val="18"/>
         </w:rPr>
-        <w:t xml:space="preserve"> APO03 Managed Enterprise Architecture y DSS04 Managed Continuity). Information Systems Audit and Control Association.</w:t>
+        <w:t xml:space="preserve"> Managed Enterprise Architecture y DSS04 Managed Continuity). Information Systems Audit and Control Association.</w:t>
       </w:r>
     </w:p>
     <w:p>
@@ -11314,7 +11527,7 @@
           <w:color w:val="334155"/>
           <w:sz w:val="18"/>
         </w:rPr>
-        <w:t>Lankhorst, M.</w:t>
+        <w:t>Lankhorst, M. (2017</w:t>
       </w:r>
       <w:r>
         <w:rPr>
@@ -11322,7 +11535,7 @@
           <w:color w:val="334155"/>
           <w:sz w:val="18"/>
         </w:rPr>
-        <w:t xml:space="preserve"> (2017). Enterprise Architecture at Work: Modelling, Communication and Analysis (4.ª ed.). Springer.</w:t>
+        <w:t>). Enterprise Architecture at Work: Modelling, Communication and Analysis (4.ª ed.). Springer.</w:t>
       </w:r>
     </w:p>
     <w:p>
@@ -11337,7 +11550,7 @@
           <w:color w:val="334155"/>
           <w:sz w:val="18"/>
         </w:rPr>
-        <w:t xml:space="preserve">MINTIC Colombia. (2020). Marco de Referencia de Arquitectura Empresarial para la gestión de TI en el Estado. Ministerio de Tecnologías de la Información y </w:t>
+        <w:t>MINTIC Colombia. (2020). Marco de Referencia de Arquitectura Empresarial para la gestión de TI en el Estado. Ministerio de Tecnologías de la Información y las Co</w:t>
       </w:r>
       <w:r>
         <w:rPr>
@@ -11345,7 +11558,7 @@
           <w:color w:val="334155"/>
           <w:sz w:val="18"/>
         </w:rPr>
-        <w:t>las Comunicaciones.</w:t>
+        <w:t>municaciones.</w:t>
       </w:r>
     </w:p>
     <w:p>
@@ -11375,7 +11588,7 @@
           <w:color w:val="334155"/>
           <w:sz w:val="18"/>
         </w:rPr>
-        <w:t>Rodríguez Bermúdez, J. R. (2015). Planificación y dire</w:t>
+        <w:t xml:space="preserve">Rodríguez Bermúdez, J. R. (2015). Planificación y dirección </w:t>
       </w:r>
       <w:r>
         <w:rPr>
@@ -11383,7 +11596,7 @@
           <w:color w:val="334155"/>
           <w:sz w:val="18"/>
         </w:rPr>
-        <w:t>cción estratégica de sistemas de información. Editorial UOC.</w:t>
+        <w:t>estratégica de sistemas de información. Editorial UOC.</w:t>
       </w:r>
     </w:p>
     <w:p>
@@ -11413,7 +11626,7 @@
           <w:color w:val="334155"/>
           <w:sz w:val="18"/>
         </w:rPr>
-        <w:t>SENASA. (2023). Manual de Proce</w:t>
+        <w:t>SENASA. (2023). Manual de Procedimien</w:t>
       </w:r>
       <w:r>
         <w:rPr>
@@ -11421,7 +11634,7 @@
           <w:color w:val="334155"/>
           <w:sz w:val="18"/>
         </w:rPr>
-        <w:t>dimientos para la Certificación Fitosanitaria de Exportación de Productos Agrícolas. Servicio Nacional de Sanidad Agraria del Perú.</w:t>
+        <w:t>tos para la Certificación Fitosanitaria de Exportación de Productos Agrícolas. Servicio Nacional de Sanidad Agraria del Perú.</w:t>
       </w:r>
     </w:p>
     <w:p>
@@ -11451,7 +11664,7 @@
           <w:color w:val="334155"/>
           <w:sz w:val="18"/>
         </w:rPr>
-        <w:t>The Open Group. (</w:t>
+        <w:t>The Open Group. (2022).</w:t>
       </w:r>
       <w:r>
         <w:rPr>
@@ -11459,7 +11672,7 @@
           <w:color w:val="334155"/>
           <w:sz w:val="18"/>
         </w:rPr>
-        <w:t>2022). ArchiMate® 3.2 Specification. The Open Group. https://pubs.opengroup.org/architecture/archimate3-doc/</w:t>
+        <w:t xml:space="preserve"> ArchiMate® 3.2 Specification. The Open Group. https://pubs.opengroup.org/architecture/archimate3-doc/</w:t>
       </w:r>
     </w:p>
     <w:p>
@@ -11467,7 +11680,7 @@
         <w:pStyle w:val="Ttulo1"/>
         <w:spacing w:after="120"/>
       </w:pPr>
-      <w:bookmarkStart w:id="22" w:name="_Toc242976734"/>
+      <w:bookmarkStart w:id="22" w:name="_Toc242977380"/>
       <w:r>
         <w:rPr>
           <w:rFonts w:ascii="Calibri" w:hAnsi="Calibri"/>
@@ -11502,7 +11715,7 @@
           <w:color w:val="64748B"/>
           <w:sz w:val="17"/>
         </w:rPr>
-        <w:t>Archivo: anexos/anexo_A_modelo_arquitectura.archimate | Enlace oficial: https:</w:t>
+        <w:t>Archivo: anexos/anexo_A_modelo_arquitectura.archimate | Enlace oficial: https://gith</w:t>
       </w:r>
       <w:r>
         <w:rPr>
@@ -11511,7 +11724,7 @@
           <w:color w:val="64748B"/>
           <w:sz w:val="17"/>
         </w:rPr>
-        <w:t>//github.com/GianfrancoArocutipa/Taller10_Empresa_01_Exportadora/tree/taller-10/anexos/anexo_A_modelo_arquitectura.archimate</w:t>
+        <w:t>ub.com/GianfrancoArocutipa/Taller10_Empresa_01_Exportadora/tree/taller-10/anexos/anexo_A_modelo_arquitectura.archimate</w:t>
       </w:r>
       <w:r>
         <w:rPr>
@@ -11528,7 +11741,7 @@
           <w:color w:val="334155"/>
           <w:sz w:val="18"/>
         </w:rPr>
-        <w:t>Descripción: Archivo oficial en formato XML nativo de Archi con la especificación completa de elementos de Negocio, Aplicación, Tec</w:t>
+        <w:t>Descripción: Archivo oficial en formato XML nativo de Archi con la especificación completa de elementos de Negocio, Aplicación, Tecnologí</w:t>
       </w:r>
       <w:r>
         <w:rPr>
@@ -11536,7 +11749,7 @@
           <w:color w:val="334155"/>
           <w:sz w:val="18"/>
         </w:rPr>
-        <w:t>nología y Motivación.</w:t>
+        <w:t>a y Motivación.</w:t>
       </w:r>
     </w:p>
     <w:p>
@@ -11565,7 +11778,7 @@
           <w:color w:val="64748B"/>
           <w:sz w:val="17"/>
         </w:rPr>
-        <w:t>Archivo: anexos/anexo_B_vista_proceso_aplicacion.png | Enlace oficial: https://github.com/GianfrancoArocutipa/Taller10_Empresa_01_Exportadora/tree/taller-10/anexos/a</w:t>
+        <w:t>Archivo: anexos/anexo_B_vista_proceso_aplicacion.png | Enlace oficial: https://github.com/GianfrancoArocutipa/Taller10_Empresa_01_Exportadora/tree/taller-10/anexos/anexo_B</w:t>
       </w:r>
       <w:r>
         <w:rPr>
@@ -11574,7 +11787,7 @@
           <w:color w:val="64748B"/>
           <w:sz w:val="17"/>
         </w:rPr>
-        <w:t>nexo_B_vista_proceso_aplicacion.png</w:t>
+        <w:t>_vista_proceso_aplicacion.png</w:t>
       </w:r>
       <w:r>
         <w:rPr>
@@ -11591,7 +11804,6 @@
           <w:color w:val="334155"/>
           <w:sz w:val="18"/>
         </w:rPr>
-        <w:lastRenderedPageBreak/>
         <w:t>Descripción: Gráfico renderizado a 300 DPI que ilustra la matriz de soporte actual e identifica los tres procesos en estado deficiente.</w:t>
       </w:r>
     </w:p>
@@ -11621,7 +11833,7 @@
           <w:color w:val="64748B"/>
           <w:sz w:val="17"/>
         </w:rPr>
-        <w:t>Archivo: anexo</w:t>
+        <w:t>Archivo: anexos/anex</w:t>
       </w:r>
       <w:r>
         <w:rPr>
@@ -11630,7 +11842,7 @@
           <w:color w:val="64748B"/>
           <w:sz w:val="17"/>
         </w:rPr>
-        <w:t>s/anexo_C_estructura_informacion.xlsx | Enlace oficial: https://github.com/GianfrancoArocutipa/Taller10_Empresa_01_Exportadora/tree/taller-10/anexos/anexo_C_estructura_informacion.xlsx</w:t>
+        <w:t>o_C_estructura_informacion.xlsx | Enlace oficial: https://github.com/GianfrancoArocutipa/Taller10_Empresa_01_Exportadora/tree/taller-10/anexos/anexo_C_estructura_informacion.xlsx</w:t>
       </w:r>
       <w:r>
         <w:rPr>
@@ -11647,7 +11859,7 @@
           <w:color w:val="334155"/>
           <w:sz w:val="18"/>
         </w:rPr>
-        <w:t>Descripción: Libro de cálculo en Excel con el inventario de entidades d</w:t>
+        <w:t>Descripción: Libro de cálculo en Excel con el inventario de entidades de dato</w:t>
       </w:r>
       <w:r>
         <w:rPr>
@@ -11655,7 +11867,7 @@
           <w:color w:val="334155"/>
           <w:sz w:val="18"/>
         </w:rPr>
-        <w:t>e datos, sistemas de residencia, discrepancias observadas, conteos y asignación de dueños por cargo.</w:t>
+        <w:t>s, sistemas de residencia, discrepancias observadas, conteos y asignación de dueños por cargo.</w:t>
       </w:r>
     </w:p>
     <w:p>
@@ -11773,6 +11985,7 @@
           <w:color w:val="334155"/>
           <w:sz w:val="18"/>
         </w:rPr>
+        <w:lastRenderedPageBreak/>
         <w:t>Descripción: Libro de cálculo estructurado con las 13 brechas categorizadas y la formulación de los 6 paquetes de trabajo con su secuencia obligada.</w:t>
       </w:r>
     </w:p>
@@ -11840,8 +12053,8 @@
       </w:r>
     </w:p>
     <w:sectPr>
-      <w:headerReference w:type="default" r:id="rId11"/>
-      <w:footerReference w:type="default" r:id="rId12"/>
+      <w:headerReference w:type="default" r:id="rId8"/>
+      <w:footerReference w:type="default" r:id="rId9"/>
       <w:footnotePr>
         <w:numRestart w:val="eachSect"/>
       </w:footnotePr>

</xml_diff>